<commit_message>
26-04-24, Nabijheid artikel bijgewerkt
</commit_message>
<xml_diff>
--- a/BlogsWord/Politiekvannabijheid.docx
+++ b/BlogsWord/Politiekvannabijheid.docx
@@ -192,43 +192,79 @@
           <w:szCs w:val="22"/>
           <w:lang w:val="nl-NL"/>
         </w:rPr>
-        <w:t>,</w:t>
-      </w:r>
-      <w:r>
-        <w:rPr>
-          <w:rFonts w:ascii="Courier New" w:hAnsi="Courier New" w:cs="Courier New"/>
-          <w:sz w:val="22"/>
-          <w:szCs w:val="22"/>
-          <w:lang w:val="nl-NL"/>
-        </w:rPr>
-        <w:t xml:space="preserve"> waar hij en generaties voor </w:t>
-      </w:r>
-      <w:r>
-        <w:rPr>
-          <w:rFonts w:ascii="Courier New" w:hAnsi="Courier New" w:cs="Courier New"/>
-          <w:sz w:val="22"/>
-          <w:szCs w:val="22"/>
-          <w:lang w:val="nl-NL"/>
-        </w:rPr>
-        <w:t xml:space="preserve">hem </w:t>
-      </w:r>
-      <w:r>
-        <w:rPr>
-          <w:rFonts w:ascii="Courier New" w:hAnsi="Courier New" w:cs="Courier New"/>
-          <w:sz w:val="22"/>
-          <w:szCs w:val="22"/>
-          <w:lang w:val="nl-NL"/>
-        </w:rPr>
-        <w:t>op h</w:t>
-      </w:r>
-      <w:r>
-        <w:rPr>
-          <w:rFonts w:ascii="Courier New" w:hAnsi="Courier New" w:cs="Courier New"/>
-          <w:sz w:val="22"/>
-          <w:szCs w:val="22"/>
-          <w:lang w:val="nl-NL"/>
-        </w:rPr>
-        <w:t xml:space="preserve">adden geleefd. Hij voelde zich door de staat helemaal alleen gelaten. Noodgedwongen moest hij in ploegendienst gaan werken en een paar jaar later kwam hij door medische redenen later nog in de zorg terecht. Toen was de afstand tot de politiek al heel groot geworden en hij stapte over van het CDA via Fortuin naar de partij van Wilders, ook om het CDA een lesje te leren. Hij voelde zich in de steek gelaten en hij was niet de enige, schrijft De Vries in dit prachtige boek. Zij is ervan overtuigd dat alles wat er in de politiek is gebeurd de laatste jaren niet is te begrijpen zonder het verhaal van mensen zoals haar vader die losgelaten zijn door de overheid. Wat haar vader wilde was erkenning als burger en </w:t>
+        <w:t>. H</w:t>
+      </w:r>
+      <w:r>
+        <w:rPr>
+          <w:rFonts w:ascii="Courier New" w:hAnsi="Courier New" w:cs="Courier New"/>
+          <w:sz w:val="22"/>
+          <w:szCs w:val="22"/>
+          <w:lang w:val="nl-NL"/>
+        </w:rPr>
+        <w:t xml:space="preserve">ij en generaties voor </w:t>
+      </w:r>
+      <w:r>
+        <w:rPr>
+          <w:rFonts w:ascii="Courier New" w:hAnsi="Courier New" w:cs="Courier New"/>
+          <w:sz w:val="22"/>
+          <w:szCs w:val="22"/>
+          <w:lang w:val="nl-NL"/>
+        </w:rPr>
+        <w:t>hem</w:t>
+      </w:r>
+      <w:r>
+        <w:rPr>
+          <w:rFonts w:ascii="Courier New" w:hAnsi="Courier New" w:cs="Courier New"/>
+          <w:sz w:val="22"/>
+          <w:szCs w:val="22"/>
+          <w:lang w:val="nl-NL"/>
+        </w:rPr>
+        <w:t xml:space="preserve"> h</w:t>
+      </w:r>
+      <w:r>
+        <w:rPr>
+          <w:rFonts w:ascii="Courier New" w:hAnsi="Courier New" w:cs="Courier New"/>
+          <w:sz w:val="22"/>
+          <w:szCs w:val="22"/>
+          <w:lang w:val="nl-NL"/>
+        </w:rPr>
+        <w:t xml:space="preserve">adden </w:t>
+      </w:r>
+      <w:r>
+        <w:rPr>
+          <w:rFonts w:ascii="Courier New" w:hAnsi="Courier New" w:cs="Courier New"/>
+          <w:sz w:val="22"/>
+          <w:szCs w:val="22"/>
+          <w:lang w:val="nl-NL"/>
+        </w:rPr>
+        <w:t xml:space="preserve">er </w:t>
+      </w:r>
+      <w:r>
+        <w:rPr>
+          <w:rFonts w:ascii="Courier New" w:hAnsi="Courier New" w:cs="Courier New"/>
+          <w:sz w:val="22"/>
+          <w:szCs w:val="22"/>
+          <w:lang w:val="nl-NL"/>
+        </w:rPr>
+        <w:t>geleefd. Hij voelde zich door de staat helemaal alleen gelaten. Noodgedwongen moest hij in ploegendienst werken en een paar jaar later kwam hij door medische redenen later nog in de zorg terecht. Toen was de afstand tot de politiek al heel groot geworden en over</w:t>
+      </w:r>
+      <w:r>
+        <w:rPr>
+          <w:rFonts w:ascii="Courier New" w:hAnsi="Courier New" w:cs="Courier New"/>
+          <w:sz w:val="22"/>
+          <w:szCs w:val="22"/>
+          <w:lang w:val="nl-NL"/>
+        </w:rPr>
+        <w:t>gestapt</w:t>
+      </w:r>
+      <w:r>
+        <w:rPr>
+          <w:rFonts w:ascii="Courier New" w:hAnsi="Courier New" w:cs="Courier New"/>
+          <w:sz w:val="22"/>
+          <w:szCs w:val="22"/>
+          <w:lang w:val="nl-NL"/>
+        </w:rPr>
+        <w:t xml:space="preserve"> van het CDA via Fortuin naar de partij van Wilders, ook om het CDA een lesje te leren. Hij voelde zich in de steek gelaten en hij was niet de enige, schrijft De Vries in dit prachtige boek. Zij is ervan overtuigd dat alles wat er in de politiek is gebeurd de laatste jaren niet is te begrijpen zonder het verhaal van mensen zoals haar vader die losgelaten zijn door de overheid. Wat haar vader wilde was erkenning als burger en </w:t>
       </w:r>
       <w:r>
         <w:rPr>
@@ -267,16 +303,106 @@
           <w:lang w:val="nl-NL"/>
         </w:rPr>
         <w:tab/>
-        <w:t xml:space="preserve">Ook voor ons eigen land, met z’n rijkdom, gezondheid en sociaal welzijn, is het toch eigenlijk onbegrijpelijk dat er zoveel wantrouwen en gevoel van verlies is ontstaan. Hoe kan dat nou en wat is hier gebeurd? Na de Tweede Wereldoorlog is er Nederland een heel goed netwerk van publieke voorzieningen opgebouwd, met goed openbaar vervoer, netwerk van huisartsen en scholen en bibliotheken voor iedereen. Daar betaalden we belastingen voor maar daar kregen we dat hoogwaardig netwerk voor terug. Die publieke voorzieningen verschraalden in de jaren tachtig wanneer er minder geld voor is, de afstand tot die voorzieningen toenemen voor veel mensen, de kwaliteit inboet, de toegankelijkheid afneemt en de belangstelling vanuit de overheid hiervoor afneemt. </w:t>
-      </w:r>
-      <w:r>
-        <w:rPr>
-          <w:rFonts w:ascii="Courier New" w:hAnsi="Courier New" w:cs="Courier New"/>
-          <w:sz w:val="22"/>
-          <w:szCs w:val="22"/>
-          <w:lang w:val="nl-NL"/>
-        </w:rPr>
-        <w:t xml:space="preserve">Er wordt niet meer geïnvesteerd </w:t>
+        <w:t xml:space="preserve">Ook voor ons eigen land, met z’n rijkdom, gezondheid en sociaal welzijn, is het toch eigenlijk </w:t>
+      </w:r>
+      <w:r>
+        <w:rPr>
+          <w:rFonts w:ascii="Courier New" w:hAnsi="Courier New" w:cs="Courier New"/>
+          <w:sz w:val="22"/>
+          <w:szCs w:val="22"/>
+          <w:lang w:val="nl-NL"/>
+        </w:rPr>
+        <w:t>vreemd</w:t>
+      </w:r>
+      <w:r>
+        <w:rPr>
+          <w:rFonts w:ascii="Courier New" w:hAnsi="Courier New" w:cs="Courier New"/>
+          <w:sz w:val="22"/>
+          <w:szCs w:val="22"/>
+          <w:lang w:val="nl-NL"/>
+        </w:rPr>
+        <w:t xml:space="preserve"> dat er zoveel wantrouwen en gevoel van verlies is ontstaan. Hoe kan dat nou en wat is hier gebeurd? Na de Tweede Wereldoorlog is er Nederland een heel goed netwerk van publieke voorzieningen opgebouwd, met goed openbaar vervoer, netwerk van huisartsen en scholen en bibliotheken voor iedereen. Daar betaalden </w:t>
+      </w:r>
+      <w:r>
+        <w:rPr>
+          <w:rFonts w:ascii="Courier New" w:hAnsi="Courier New" w:cs="Courier New"/>
+          <w:sz w:val="22"/>
+          <w:szCs w:val="22"/>
+          <w:lang w:val="nl-NL"/>
+        </w:rPr>
+        <w:t xml:space="preserve">de mensen </w:t>
+      </w:r>
+      <w:r>
+        <w:rPr>
+          <w:rFonts w:ascii="Courier New" w:hAnsi="Courier New" w:cs="Courier New"/>
+          <w:sz w:val="22"/>
+          <w:szCs w:val="22"/>
+          <w:lang w:val="nl-NL"/>
+        </w:rPr>
+        <w:t xml:space="preserve">belasting voor </w:t>
+      </w:r>
+      <w:r>
+        <w:rPr>
+          <w:rFonts w:ascii="Courier New" w:hAnsi="Courier New" w:cs="Courier New"/>
+          <w:sz w:val="22"/>
+          <w:szCs w:val="22"/>
+          <w:lang w:val="nl-NL"/>
+        </w:rPr>
+        <w:t xml:space="preserve">en </w:t>
+      </w:r>
+      <w:r>
+        <w:rPr>
+          <w:rFonts w:ascii="Courier New" w:hAnsi="Courier New" w:cs="Courier New"/>
+          <w:sz w:val="22"/>
+          <w:szCs w:val="22"/>
+          <w:lang w:val="nl-NL"/>
+        </w:rPr>
+        <w:t>daar kregen</w:t>
+      </w:r>
+      <w:r>
+        <w:rPr>
+          <w:rFonts w:ascii="Courier New" w:hAnsi="Courier New" w:cs="Courier New"/>
+          <w:sz w:val="22"/>
+          <w:szCs w:val="22"/>
+          <w:lang w:val="nl-NL"/>
+        </w:rPr>
+        <w:t xml:space="preserve"> ze veel </w:t>
+      </w:r>
+      <w:r>
+        <w:rPr>
+          <w:rFonts w:ascii="Courier New" w:hAnsi="Courier New" w:cs="Courier New"/>
+          <w:sz w:val="22"/>
+          <w:szCs w:val="22"/>
+          <w:lang w:val="nl-NL"/>
+        </w:rPr>
+        <w:t xml:space="preserve">voor terug. Die publieke voorzieningen verschraalden in de jaren tachtig wanneer er minder geld voor is, de afstand tot die voorzieningen toenemen voor veel mensen, de kwaliteit inboet, de toegankelijkheid afneemt en de belangstelling vanuit de overheid hiervoor afneemt. </w:t>
+      </w:r>
+      <w:r>
+        <w:rPr>
+          <w:rFonts w:ascii="Courier New" w:hAnsi="Courier New" w:cs="Courier New"/>
+          <w:sz w:val="22"/>
+          <w:szCs w:val="22"/>
+          <w:lang w:val="nl-NL"/>
+        </w:rPr>
+        <w:t xml:space="preserve">Er wordt </w:t>
+      </w:r>
+      <w:r>
+        <w:rPr>
+          <w:rFonts w:ascii="Courier New" w:hAnsi="Courier New" w:cs="Courier New"/>
+          <w:sz w:val="22"/>
+          <w:szCs w:val="22"/>
+          <w:lang w:val="nl-NL"/>
+        </w:rPr>
+        <w:t>steeds minder</w:t>
+      </w:r>
+      <w:r>
+        <w:rPr>
+          <w:rFonts w:ascii="Courier New" w:hAnsi="Courier New" w:cs="Courier New"/>
+          <w:sz w:val="22"/>
+          <w:szCs w:val="22"/>
+          <w:lang w:val="nl-NL"/>
+        </w:rPr>
+        <w:t xml:space="preserve"> geïnvesteerd in zorg, </w:t>
       </w:r>
       <w:r>
         <w:rPr>
@@ -286,36 +412,142 @@
           <w:lang w:val="nl-NL"/>
         </w:rPr>
         <w:lastRenderedPageBreak/>
-        <w:t xml:space="preserve">in zorg, huisvesting, onderwijs en duurzame infrastructuur. </w:t>
-      </w:r>
-      <w:proofErr w:type="spellStart"/>
-      <w:r>
-        <w:rPr>
-          <w:rFonts w:ascii="Courier New" w:hAnsi="Courier New" w:cs="Courier New"/>
-          <w:sz w:val="22"/>
-          <w:szCs w:val="22"/>
-          <w:lang w:val="nl-NL"/>
-        </w:rPr>
-        <w:t>Er</w:t>
-      </w:r>
-      <w:proofErr w:type="spellEnd"/>
-      <w:r>
-        <w:rPr>
-          <w:rFonts w:ascii="Courier New" w:hAnsi="Courier New" w:cs="Courier New"/>
-          <w:sz w:val="22"/>
-          <w:szCs w:val="22"/>
-          <w:lang w:val="nl-NL"/>
-        </w:rPr>
-        <w:t xml:space="preserve"> ontstaat materiële en morele ongelijkheid. Bepaalde groepen tellen minder mee en er wordt op neergekeken. Er ontstaat grote onvrede en er worden andere politieke en ideologische keuzes gemaakt.</w:t>
-      </w:r>
-      <w:r>
-        <w:rPr>
-          <w:rFonts w:ascii="Courier New" w:hAnsi="Courier New" w:cs="Courier New"/>
-          <w:sz w:val="22"/>
-          <w:szCs w:val="22"/>
-          <w:lang w:val="nl-NL"/>
-        </w:rPr>
-        <w:t xml:space="preserve"> De staat gaat een andere rol vervullen. Nabijheid, erkenning en bescherming maken plaats voor wat er absoluut nodig is en wat geld oplevert en burgers zelf worden consumenten. En als ze de staat nodig hebben, is die nauwelijks te bereiken. ‘Het gevoel dat er zorg en aandacht is voor jou op de plek waar je woont en leeft, verdween uit het dagelijks leven’. </w:t>
+        <w:t>huisvesting, onderwijs en duurzame infrastructuur</w:t>
+      </w:r>
+      <w:r>
+        <w:rPr>
+          <w:rFonts w:ascii="Courier New" w:hAnsi="Courier New" w:cs="Courier New"/>
+          <w:sz w:val="22"/>
+          <w:szCs w:val="22"/>
+          <w:lang w:val="nl-NL"/>
+        </w:rPr>
+        <w:t xml:space="preserve"> en e</w:t>
+      </w:r>
+      <w:r>
+        <w:rPr>
+          <w:rFonts w:ascii="Courier New" w:hAnsi="Courier New" w:cs="Courier New"/>
+          <w:sz w:val="22"/>
+          <w:szCs w:val="22"/>
+          <w:lang w:val="nl-NL"/>
+        </w:rPr>
+        <w:t xml:space="preserve">r ontstaat materiële en morele ongelijkheid. Bepaalde groepen tellen minder mee en </w:t>
+      </w:r>
+      <w:r>
+        <w:rPr>
+          <w:rFonts w:ascii="Courier New" w:hAnsi="Courier New" w:cs="Courier New"/>
+          <w:sz w:val="22"/>
+          <w:szCs w:val="22"/>
+          <w:lang w:val="nl-NL"/>
+        </w:rPr>
+        <w:t>op hen</w:t>
+      </w:r>
+      <w:r>
+        <w:rPr>
+          <w:rFonts w:ascii="Courier New" w:hAnsi="Courier New" w:cs="Courier New"/>
+          <w:sz w:val="22"/>
+          <w:szCs w:val="22"/>
+          <w:lang w:val="nl-NL"/>
+        </w:rPr>
+        <w:t xml:space="preserve"> word</w:t>
+      </w:r>
+      <w:r>
+        <w:rPr>
+          <w:rFonts w:ascii="Courier New" w:hAnsi="Courier New" w:cs="Courier New"/>
+          <w:sz w:val="22"/>
+          <w:szCs w:val="22"/>
+          <w:lang w:val="nl-NL"/>
+        </w:rPr>
+        <w:t>t</w:t>
+      </w:r>
+      <w:r>
+        <w:rPr>
+          <w:rFonts w:ascii="Courier New" w:hAnsi="Courier New" w:cs="Courier New"/>
+          <w:sz w:val="22"/>
+          <w:szCs w:val="22"/>
+          <w:lang w:val="nl-NL"/>
+        </w:rPr>
+        <w:t xml:space="preserve"> neergekeken. Er ontstaat grote onvrede en er worden andere politieke en ideologische keuzes gemaakt.</w:t>
+      </w:r>
+      <w:r>
+        <w:rPr>
+          <w:rFonts w:ascii="Courier New" w:hAnsi="Courier New" w:cs="Courier New"/>
+          <w:sz w:val="22"/>
+          <w:szCs w:val="22"/>
+          <w:lang w:val="nl-NL"/>
+        </w:rPr>
+        <w:t xml:space="preserve"> De staat gaat een andere rol vervullen. Nabijheid, erkenning en bescherming maken plaats voor wat er </w:t>
+      </w:r>
+      <w:r>
+        <w:rPr>
+          <w:rFonts w:ascii="Courier New" w:hAnsi="Courier New" w:cs="Courier New"/>
+          <w:sz w:val="22"/>
+          <w:szCs w:val="22"/>
+          <w:lang w:val="nl-NL"/>
+        </w:rPr>
+        <w:t>nog hoogstnoodzakelijk</w:t>
+      </w:r>
+      <w:r>
+        <w:rPr>
+          <w:rFonts w:ascii="Courier New" w:hAnsi="Courier New" w:cs="Courier New"/>
+          <w:sz w:val="22"/>
+          <w:szCs w:val="22"/>
+          <w:lang w:val="nl-NL"/>
+        </w:rPr>
+        <w:t xml:space="preserve"> is en wat geld oplevert</w:t>
+      </w:r>
+      <w:r>
+        <w:rPr>
+          <w:rFonts w:ascii="Courier New" w:hAnsi="Courier New" w:cs="Courier New"/>
+          <w:sz w:val="22"/>
+          <w:szCs w:val="22"/>
+          <w:lang w:val="nl-NL"/>
+        </w:rPr>
+        <w:t>. B</w:t>
+      </w:r>
+      <w:r>
+        <w:rPr>
+          <w:rFonts w:ascii="Courier New" w:hAnsi="Courier New" w:cs="Courier New"/>
+          <w:sz w:val="22"/>
+          <w:szCs w:val="22"/>
+          <w:lang w:val="nl-NL"/>
+        </w:rPr>
+        <w:t>urgers zelf worden consumenten</w:t>
+      </w:r>
+      <w:r>
+        <w:rPr>
+          <w:rFonts w:ascii="Courier New" w:hAnsi="Courier New" w:cs="Courier New"/>
+          <w:sz w:val="22"/>
+          <w:szCs w:val="22"/>
+          <w:lang w:val="nl-NL"/>
+        </w:rPr>
+        <w:t xml:space="preserve"> e</w:t>
+      </w:r>
+      <w:r>
+        <w:rPr>
+          <w:rFonts w:ascii="Courier New" w:hAnsi="Courier New" w:cs="Courier New"/>
+          <w:sz w:val="22"/>
+          <w:szCs w:val="22"/>
+          <w:lang w:val="nl-NL"/>
+        </w:rPr>
+        <w:t>n als ze de staat nodig hebben</w:t>
+      </w:r>
+      <w:r>
+        <w:rPr>
+          <w:rFonts w:ascii="Courier New" w:hAnsi="Courier New" w:cs="Courier New"/>
+          <w:sz w:val="22"/>
+          <w:szCs w:val="22"/>
+          <w:lang w:val="nl-NL"/>
+        </w:rPr>
+        <w:t xml:space="preserve"> voor wat ook</w:t>
+      </w:r>
+      <w:r>
+        <w:rPr>
+          <w:rFonts w:ascii="Courier New" w:hAnsi="Courier New" w:cs="Courier New"/>
+          <w:sz w:val="22"/>
+          <w:szCs w:val="22"/>
+          <w:lang w:val="nl-NL"/>
+        </w:rPr>
+        <w:t xml:space="preserve">, is die nauwelijks te bereiken. ‘Het gevoel dat er zorg en aandacht is voor jou op de plek waar je woont en leeft, verdween uit het dagelijks leven’. </w:t>
       </w:r>
       <w:r>
         <w:rPr>
@@ -354,7 +586,25 @@
           <w:szCs w:val="22"/>
           <w:lang w:val="nl-NL"/>
         </w:rPr>
-        <w:t>, die het over ‘wij tegen zij’ hebben en die naar de migranten en de elite als zondebokken kijken. Dan zijn er politici die dit verhaal naar hun hand zetten en die er een eenvoudig verhaal van maken en die simpele oplossingen komen. Het vertrouwen in de staat, instituties en politici brokkelt vervolgens langzaam. A</w:t>
+        <w:t xml:space="preserve">, die het over ‘wij tegen zij’ hebben en die naar de migranten en de elite als zondebokken kijken. Dan zijn er politici die dit verhaal naar hun hand zetten en die er een eenvoudig verhaal </w:t>
+      </w:r>
+      <w:r>
+        <w:rPr>
+          <w:rFonts w:ascii="Courier New" w:hAnsi="Courier New" w:cs="Courier New"/>
+          <w:sz w:val="22"/>
+          <w:szCs w:val="22"/>
+          <w:lang w:val="nl-NL"/>
+        </w:rPr>
+        <w:t xml:space="preserve">met simpele oplossingen </w:t>
+      </w:r>
+      <w:r>
+        <w:rPr>
+          <w:rFonts w:ascii="Courier New" w:hAnsi="Courier New" w:cs="Courier New"/>
+          <w:sz w:val="22"/>
+          <w:szCs w:val="22"/>
+          <w:lang w:val="nl-NL"/>
+        </w:rPr>
+        <w:t>van maken. Het vertrouwen in de staat, instituties en politici brokkelt langzaam. A</w:t>
       </w:r>
       <w:r>
         <w:rPr>
@@ -390,7 +640,43 @@
           <w:szCs w:val="22"/>
           <w:lang w:val="nl-NL"/>
         </w:rPr>
-        <w:t xml:space="preserve"> en versterken het verhaal en zo lijkt het een verhaal van iedereen te worden, wordt het breed gedragen en lijdt de gemeenschap als geheel eronder.</w:t>
+        <w:t xml:space="preserve"> en versterken het verhaal</w:t>
+      </w:r>
+      <w:r>
+        <w:rPr>
+          <w:rFonts w:ascii="Courier New" w:hAnsi="Courier New" w:cs="Courier New"/>
+          <w:sz w:val="22"/>
+          <w:szCs w:val="22"/>
+          <w:lang w:val="nl-NL"/>
+        </w:rPr>
+        <w:t xml:space="preserve"> en </w:t>
+      </w:r>
+      <w:r>
+        <w:rPr>
+          <w:rFonts w:ascii="Courier New" w:hAnsi="Courier New" w:cs="Courier New"/>
+          <w:sz w:val="22"/>
+          <w:szCs w:val="22"/>
+          <w:lang w:val="nl-NL"/>
+        </w:rPr>
+        <w:t xml:space="preserve">het </w:t>
+      </w:r>
+      <w:r>
+        <w:rPr>
+          <w:rFonts w:ascii="Courier New" w:hAnsi="Courier New" w:cs="Courier New"/>
+          <w:sz w:val="22"/>
+          <w:szCs w:val="22"/>
+          <w:lang w:val="nl-NL"/>
+        </w:rPr>
+        <w:t xml:space="preserve">lijkt </w:t>
+      </w:r>
+      <w:r>
+        <w:rPr>
+          <w:rFonts w:ascii="Courier New" w:hAnsi="Courier New" w:cs="Courier New"/>
+          <w:sz w:val="22"/>
+          <w:szCs w:val="22"/>
+          <w:lang w:val="nl-NL"/>
+        </w:rPr>
+        <w:t>een verhaal van iedereen te worden.</w:t>
       </w:r>
       <w:r>
         <w:rPr>
@@ -408,16 +694,88 @@
           <w:szCs w:val="22"/>
           <w:lang w:val="nl-NL"/>
         </w:rPr>
-        <w:t>Het wordt het verhaal van verlies, achterstelling en onbehagen en van verbroken beloftes en geschonden verwachtingen</w:t>
-      </w:r>
-      <w:r>
-        <w:rPr>
-          <w:rFonts w:ascii="Courier New" w:hAnsi="Courier New" w:cs="Courier New"/>
-          <w:sz w:val="22"/>
-          <w:szCs w:val="22"/>
-          <w:lang w:val="nl-NL"/>
-        </w:rPr>
-        <w:t>. Alles wat er tegelijkertijd gebeurt aan marktwerking, globalisering, vergrijzing en beleidskeuzen die worden gemaakt, worden gereduceerd tot dat simpele verhaal van ‘wat van ons is nemen ze af’. In heel Europa is dit gebeurd en De Vries laat zien wat ze zelf heeft meegemaakt in Berlijn, Londen, Rome, Parijs en Den Haag.</w:t>
+        <w:t xml:space="preserve">Het </w:t>
+      </w:r>
+      <w:r>
+        <w:rPr>
+          <w:rFonts w:ascii="Courier New" w:hAnsi="Courier New" w:cs="Courier New"/>
+          <w:sz w:val="22"/>
+          <w:szCs w:val="22"/>
+          <w:lang w:val="nl-NL"/>
+        </w:rPr>
+        <w:t>is</w:t>
+      </w:r>
+      <w:r>
+        <w:rPr>
+          <w:rFonts w:ascii="Courier New" w:hAnsi="Courier New" w:cs="Courier New"/>
+          <w:sz w:val="22"/>
+          <w:szCs w:val="22"/>
+          <w:lang w:val="nl-NL"/>
+        </w:rPr>
+        <w:t xml:space="preserve"> het verhaal van verlies, achterstelling en onbehagen en van verbroken beloftes en geschonden verwachtingen</w:t>
+      </w:r>
+      <w:r>
+        <w:rPr>
+          <w:rFonts w:ascii="Courier New" w:hAnsi="Courier New" w:cs="Courier New"/>
+          <w:sz w:val="22"/>
+          <w:szCs w:val="22"/>
+          <w:lang w:val="nl-NL"/>
+        </w:rPr>
+        <w:t xml:space="preserve">. </w:t>
+      </w:r>
+      <w:r>
+        <w:rPr>
+          <w:rFonts w:ascii="Courier New" w:hAnsi="Courier New" w:cs="Courier New"/>
+          <w:sz w:val="22"/>
+          <w:szCs w:val="22"/>
+          <w:lang w:val="nl-NL"/>
+        </w:rPr>
+        <w:t xml:space="preserve">De gemeenschap als geheel lijdt eronder. </w:t>
+      </w:r>
+      <w:r>
+        <w:rPr>
+          <w:rFonts w:ascii="Courier New" w:hAnsi="Courier New" w:cs="Courier New"/>
+          <w:sz w:val="22"/>
+          <w:szCs w:val="22"/>
+          <w:lang w:val="nl-NL"/>
+        </w:rPr>
+        <w:t xml:space="preserve">Alles wat er tegelijkertijd gebeurt </w:t>
+      </w:r>
+      <w:r>
+        <w:rPr>
+          <w:rFonts w:ascii="Courier New" w:hAnsi="Courier New" w:cs="Courier New"/>
+          <w:sz w:val="22"/>
+          <w:szCs w:val="22"/>
+          <w:lang w:val="nl-NL"/>
+        </w:rPr>
+        <w:t xml:space="preserve">zoals </w:t>
+      </w:r>
+      <w:r>
+        <w:rPr>
+          <w:rFonts w:ascii="Courier New" w:hAnsi="Courier New" w:cs="Courier New"/>
+          <w:sz w:val="22"/>
+          <w:szCs w:val="22"/>
+          <w:lang w:val="nl-NL"/>
+        </w:rPr>
+        <w:t>marktwerking, globalisering, vergrijzing en beleidskeuzen die worden gemaakt, word</w:t>
+      </w:r>
+      <w:r>
+        <w:rPr>
+          <w:rFonts w:ascii="Courier New" w:hAnsi="Courier New" w:cs="Courier New"/>
+          <w:sz w:val="22"/>
+          <w:szCs w:val="22"/>
+          <w:lang w:val="nl-NL"/>
+        </w:rPr>
+        <w:t>t</w:t>
+      </w:r>
+      <w:r>
+        <w:rPr>
+          <w:rFonts w:ascii="Courier New" w:hAnsi="Courier New" w:cs="Courier New"/>
+          <w:sz w:val="22"/>
+          <w:szCs w:val="22"/>
+          <w:lang w:val="nl-NL"/>
+        </w:rPr>
+        <w:t xml:space="preserve"> gereduceerd tot ‘wat van ons is nemen ze af’. </w:t>
       </w:r>
     </w:p>
     <w:p>
@@ -459,7 +817,93 @@
           <w:szCs w:val="22"/>
           <w:lang w:val="nl-NL"/>
         </w:rPr>
-        <w:t>Duitsland</w:t>
+        <w:t xml:space="preserve">In heel Europa is dit gebeurd en De Vries laat zien wat ze zelf heeft meegemaakt in </w:t>
+      </w:r>
+      <w:r>
+        <w:rPr>
+          <w:rFonts w:ascii="Courier New" w:hAnsi="Courier New" w:cs="Courier New"/>
+          <w:sz w:val="22"/>
+          <w:szCs w:val="22"/>
+          <w:lang w:val="nl-NL"/>
+        </w:rPr>
+        <w:t xml:space="preserve">Duitsland, Engeland, Italië, Frankrijk en Nederland. In die landen studeert en werkt ze al sociaal wetenschapper die empirisch onderzoek doet naar deze sociale ontwikkelingen. In Duitsland raakt ze in 1999 betrokken bij een onderzoek naar de sociale en politieke gevolgen van de Duitse eenwording gedurende de afgelopen tien jaar. In de jaren negentig was de nadruk op bezuinigen en budgetdiscipline komen te liggen. Economisch deed het land het goed maar de maatregelen had een hoge sociale prijs waar met name mensen uit het oosten een gevoel van verlies en achterstelling ervaren. Scholen, ziekenhuizen en treinstations worden gesloten </w:t>
+      </w:r>
+      <w:r>
+        <w:rPr>
+          <w:rFonts w:ascii="Courier New" w:hAnsi="Courier New" w:cs="Courier New"/>
+          <w:sz w:val="22"/>
+          <w:szCs w:val="22"/>
+          <w:lang w:val="nl-NL"/>
+        </w:rPr>
+        <w:t xml:space="preserve">in Saksen, Thüringen en Brandenburg </w:t>
+      </w:r>
+      <w:r>
+        <w:rPr>
+          <w:rFonts w:ascii="Courier New" w:hAnsi="Courier New" w:cs="Courier New"/>
+          <w:sz w:val="22"/>
+          <w:szCs w:val="22"/>
+          <w:lang w:val="nl-NL"/>
+        </w:rPr>
+        <w:t xml:space="preserve">en </w:t>
+      </w:r>
+      <w:r>
+        <w:rPr>
+          <w:rFonts w:ascii="Courier New" w:hAnsi="Courier New" w:cs="Courier New"/>
+          <w:sz w:val="22"/>
+          <w:szCs w:val="22"/>
+          <w:lang w:val="nl-NL"/>
+        </w:rPr>
+        <w:lastRenderedPageBreak/>
+        <w:t xml:space="preserve">op het leven van de </w:t>
+      </w:r>
+      <w:proofErr w:type="spellStart"/>
+      <w:r>
+        <w:rPr>
+          <w:rFonts w:ascii="Courier New" w:hAnsi="Courier New" w:cs="Courier New"/>
+          <w:sz w:val="22"/>
+          <w:szCs w:val="22"/>
+          <w:lang w:val="nl-NL"/>
+        </w:rPr>
+        <w:t>Ossies</w:t>
+      </w:r>
+      <w:proofErr w:type="spellEnd"/>
+      <w:r>
+        <w:rPr>
+          <w:rFonts w:ascii="Courier New" w:hAnsi="Courier New" w:cs="Courier New"/>
+          <w:sz w:val="22"/>
+          <w:szCs w:val="22"/>
+          <w:lang w:val="nl-NL"/>
+        </w:rPr>
+        <w:t xml:space="preserve"> wordt neergekeken. Alles lijkt tegen jou gericht te zijn. </w:t>
+      </w:r>
+      <w:r>
+        <w:rPr>
+          <w:rFonts w:ascii="Courier New" w:hAnsi="Courier New" w:cs="Courier New"/>
+          <w:sz w:val="22"/>
+          <w:szCs w:val="22"/>
+          <w:lang w:val="nl-NL"/>
+        </w:rPr>
+        <w:t xml:space="preserve">Modernisering en rationalisering wordt door de mensen zelf als afbraak ervaren. Het morele kader van ooit is er niet meer en mensen worden ontvankelijk voor de rechts-radicale en </w:t>
+      </w:r>
+      <w:proofErr w:type="spellStart"/>
+      <w:r>
+        <w:rPr>
+          <w:rFonts w:ascii="Courier New" w:hAnsi="Courier New" w:cs="Courier New"/>
+          <w:sz w:val="22"/>
+          <w:szCs w:val="22"/>
+          <w:lang w:val="nl-NL"/>
+        </w:rPr>
+        <w:t>AfD</w:t>
+      </w:r>
+      <w:proofErr w:type="spellEnd"/>
+      <w:r>
+        <w:rPr>
+          <w:rFonts w:ascii="Courier New" w:hAnsi="Courier New" w:cs="Courier New"/>
+          <w:sz w:val="22"/>
+          <w:szCs w:val="22"/>
+          <w:lang w:val="nl-NL"/>
+        </w:rPr>
+        <w:t xml:space="preserve"> verhalen die het verlies betekenis geven. Zij voelen heel goed aan dat dat dat verlies meer existentieel dan economisch is. </w:t>
       </w:r>
     </w:p>
     <w:p>
@@ -479,7 +923,62 @@
           <w:szCs w:val="22"/>
           <w:lang w:val="nl-NL"/>
         </w:rPr>
-        <w:t>Verenigd Konikrijk</w:t>
+        <w:tab/>
+        <w:t xml:space="preserve">De Vries gaat terug naar Nederland om onderzoek te doen en te promoveren op analyses van kiezersbestanden en wordt </w:t>
+      </w:r>
+      <w:r>
+        <w:rPr>
+          <w:rFonts w:ascii="Courier New" w:hAnsi="Courier New" w:cs="Courier New"/>
+          <w:sz w:val="22"/>
+          <w:szCs w:val="22"/>
+          <w:lang w:val="nl-NL"/>
+        </w:rPr>
+        <w:t xml:space="preserve">in 2012 </w:t>
+      </w:r>
+      <w:r>
+        <w:rPr>
+          <w:rFonts w:ascii="Courier New" w:hAnsi="Courier New" w:cs="Courier New"/>
+          <w:sz w:val="22"/>
+          <w:szCs w:val="22"/>
+          <w:lang w:val="nl-NL"/>
+        </w:rPr>
+        <w:t>hoogleraar in Oxford</w:t>
+      </w:r>
+      <w:r>
+        <w:rPr>
+          <w:rFonts w:ascii="Courier New" w:hAnsi="Courier New" w:cs="Courier New"/>
+          <w:sz w:val="22"/>
+          <w:szCs w:val="22"/>
+          <w:lang w:val="nl-NL"/>
+        </w:rPr>
+        <w:t>, Engeland. Daar hoort ze over huisartsen die niet te bereiken zijn en buslijnen die zijn geschrapt en dat het allemaal aan Brussel en de immigrant ligt.</w:t>
+      </w:r>
+      <w:r>
+        <w:rPr>
+          <w:rFonts w:ascii="Courier New" w:hAnsi="Courier New" w:cs="Courier New"/>
+          <w:sz w:val="22"/>
+          <w:szCs w:val="22"/>
+          <w:lang w:val="nl-NL"/>
+        </w:rPr>
+        <w:t xml:space="preserve"> </w:t>
+      </w:r>
+      <w:r>
+        <w:rPr>
+          <w:rFonts w:ascii="Courier New" w:hAnsi="Courier New" w:cs="Courier New"/>
+          <w:sz w:val="22"/>
+          <w:szCs w:val="22"/>
+          <w:lang w:val="nl-NL"/>
+        </w:rPr>
+        <w:t>Hier is het vooral de National Health Service die niet meer werkt, de grote trots van het land, de zorg die iedereen geboden wordt als je het nodig hebt. Als die NHS hapert, hapert de staat. Zeker wanneer het een wereld van wachten, uitstellen en afzien wordt. Als die overheid niet levert, komen er politici die het geheel wel eens flink willen opschudden. Ondanks dat er sterk op lokale overheden en de NHS is bezuinigd, kr</w:t>
+      </w:r>
+      <w:r>
+        <w:rPr>
+          <w:rFonts w:ascii="Courier New" w:hAnsi="Courier New" w:cs="Courier New"/>
+          <w:sz w:val="22"/>
+          <w:szCs w:val="22"/>
+          <w:lang w:val="nl-NL"/>
+        </w:rPr>
+        <w:t>ijgt de EU de schuld. De falende politiek wordt zichtbaar bij de lege balie of de onbereikbare huisarts.</w:t>
       </w:r>
     </w:p>
     <w:p>
@@ -499,8 +998,58 @@
           <w:szCs w:val="22"/>
           <w:lang w:val="nl-NL"/>
         </w:rPr>
-        <w:t>Italië</w:t>
-      </w:r>
+        <w:tab/>
+        <w:t xml:space="preserve">In Engeland was het haar behoorlijk benauwend geworden en ze vertrekt via Nederland naar Milaan (Italië). In Milaan en andere delen van Noord-Italië leef je nog wel in een roes van vooruitgang, maar in andere delen groeide wel degelijk dat gevoel van stilstand dat haar zo bekend voorkomt. In </w:t>
+      </w:r>
+      <w:proofErr w:type="spellStart"/>
+      <w:r>
+        <w:rPr>
+          <w:rFonts w:ascii="Courier New" w:hAnsi="Courier New" w:cs="Courier New"/>
+          <w:sz w:val="22"/>
+          <w:szCs w:val="22"/>
+          <w:lang w:val="nl-NL"/>
+        </w:rPr>
+        <w:t>Puglia</w:t>
+      </w:r>
+      <w:proofErr w:type="spellEnd"/>
+      <w:r>
+        <w:rPr>
+          <w:rFonts w:ascii="Courier New" w:hAnsi="Courier New" w:cs="Courier New"/>
+          <w:sz w:val="22"/>
+          <w:szCs w:val="22"/>
+          <w:lang w:val="nl-NL"/>
+        </w:rPr>
+        <w:t xml:space="preserve"> bijvoorbeeld, in het zuiden waar een boombacterie miljoenen olijfbomen heeft vernietigd. De olijfboom die een zo centrale plek inneemt in het dagelijkse leven van hun, veranderde dat leven volledig. Daar in die omgevi</w:t>
+      </w:r>
+      <w:r>
+        <w:rPr>
+          <w:rFonts w:ascii="Courier New" w:hAnsi="Courier New" w:cs="Courier New"/>
+          <w:sz w:val="22"/>
+          <w:szCs w:val="22"/>
+          <w:lang w:val="nl-NL"/>
+        </w:rPr>
+        <w:t>ng van verlaten dorpen, ingeslapen stations, nu ook nog in dat landschap met die vele dode olijfbomen en de staat op geen enkele manier aanwezig is, wordt alles wel heel erg leeg.</w:t>
+      </w:r>
+      <w:r>
+        <w:rPr>
+          <w:rFonts w:ascii="Courier New" w:hAnsi="Courier New" w:cs="Courier New"/>
+          <w:sz w:val="22"/>
+          <w:szCs w:val="22"/>
+          <w:lang w:val="nl-NL"/>
+        </w:rPr>
+        <w:t xml:space="preserve"> </w:t>
+      </w:r>
+    </w:p>
+    <w:p>
+      <w:pPr>
+        <w:spacing w:line="360" w:lineRule="auto"/>
+        <w:rPr>
+          <w:rFonts w:ascii="Courier New" w:hAnsi="Courier New" w:cs="Courier New"/>
+          <w:sz w:val="22"/>
+          <w:szCs w:val="22"/>
+          <w:lang w:val="nl-NL"/>
+        </w:rPr>
+      </w:pPr>
     </w:p>
     <w:p>
       <w:pPr>

</xml_diff>

<commit_message>
26-04-26, Politiek van nabijheid bijgewerkt
</commit_message>
<xml_diff>
--- a/BlogsWord/Politiekvannabijheid.docx
+++ b/BlogsWord/Politiekvannabijheid.docx
@@ -76,6 +76,8 @@
       <w:r>
         <w:rPr>
           <w:rFonts w:ascii="Courier New" w:hAnsi="Courier New" w:cs="Courier New"/>
+          <w:i/>
+          <w:iCs/>
           <w:sz w:val="22"/>
           <w:szCs w:val="22"/>
           <w:lang w:val="nl-NL"/>
@@ -85,6 +87,8 @@
       <w:r>
         <w:rPr>
           <w:rFonts w:ascii="Courier New" w:hAnsi="Courier New" w:cs="Courier New"/>
+          <w:i/>
+          <w:iCs/>
           <w:sz w:val="22"/>
           <w:szCs w:val="22"/>
           <w:lang w:val="nl-NL"/>
@@ -145,7 +149,43 @@
           <w:szCs w:val="22"/>
           <w:lang w:val="nl-NL"/>
         </w:rPr>
-        <w:t xml:space="preserve">“Waarom betaal ik nog belasting n houd ik me aan de regels als ik er toch niets voor terugkrijg?” en “Zakkenvullers, daar in Den Haag”, dat is wat de vader op een gegeven moment over de politiek zei. In de tachtiger jaren was hij door bezuinigingen en ook nieuwe regels uit Europa zijn boerderij </w:t>
+        <w:t xml:space="preserve">“Waarom betaal ik nog belasting </w:t>
+      </w:r>
+      <w:r>
+        <w:rPr>
+          <w:rFonts w:ascii="Courier New" w:hAnsi="Courier New" w:cs="Courier New"/>
+          <w:sz w:val="22"/>
+          <w:szCs w:val="22"/>
+          <w:lang w:val="nl-NL"/>
+        </w:rPr>
+        <w:t>e</w:t>
+      </w:r>
+      <w:r>
+        <w:rPr>
+          <w:rFonts w:ascii="Courier New" w:hAnsi="Courier New" w:cs="Courier New"/>
+          <w:sz w:val="22"/>
+          <w:szCs w:val="22"/>
+          <w:lang w:val="nl-NL"/>
+        </w:rPr>
+        <w:t xml:space="preserve">n houd ik me aan de regels als ik er toch niets voor terugkrijg?” en “Zakkenvullers, daar in Den Haag”, dat is wat de vader op een gegeven moment over de politiek </w:t>
+      </w:r>
+      <w:r>
+        <w:rPr>
+          <w:rFonts w:ascii="Courier New" w:hAnsi="Courier New" w:cs="Courier New"/>
+          <w:sz w:val="22"/>
+          <w:szCs w:val="22"/>
+          <w:lang w:val="nl-NL"/>
+        </w:rPr>
+        <w:t xml:space="preserve">in Nederland </w:t>
+      </w:r>
+      <w:r>
+        <w:rPr>
+          <w:rFonts w:ascii="Courier New" w:hAnsi="Courier New" w:cs="Courier New"/>
+          <w:sz w:val="22"/>
+          <w:szCs w:val="22"/>
+          <w:lang w:val="nl-NL"/>
+        </w:rPr>
+        <w:t xml:space="preserve">zei. In de tachtiger jaren was hij door bezuinigingen en ook nieuwe regels uit Europa zijn boerderij </w:t>
       </w:r>
       <w:r>
         <w:rPr>
@@ -246,7 +286,72 @@
           <w:szCs w:val="22"/>
           <w:lang w:val="nl-NL"/>
         </w:rPr>
-        <w:t>geleefd. Hij voelde zich door de staat helemaal alleen gelaten. Noodgedwongen moest hij in ploegendienst werken en een paar jaar later kwam hij door medische redenen later nog in de zorg terecht. Toen was de afstand tot de politiek al heel groot geworden en over</w:t>
+        <w:t>geleefd</w:t>
+      </w:r>
+      <w:r>
+        <w:rPr>
+          <w:rFonts w:ascii="Courier New" w:hAnsi="Courier New" w:cs="Courier New"/>
+          <w:sz w:val="22"/>
+          <w:szCs w:val="22"/>
+          <w:lang w:val="nl-NL"/>
+        </w:rPr>
+        <w:t xml:space="preserve"> en zich </w:t>
+      </w:r>
+      <w:proofErr w:type="spellStart"/>
+      <w:r>
+        <w:rPr>
+          <w:rFonts w:ascii="Courier New" w:hAnsi="Courier New" w:cs="Courier New"/>
+          <w:sz w:val="22"/>
+          <w:szCs w:val="22"/>
+          <w:lang w:val="nl-NL"/>
+        </w:rPr>
+        <w:t>thuisgevoeld</w:t>
+      </w:r>
+      <w:proofErr w:type="spellEnd"/>
+      <w:r>
+        <w:rPr>
+          <w:rFonts w:ascii="Courier New" w:hAnsi="Courier New" w:cs="Courier New"/>
+          <w:sz w:val="22"/>
+          <w:szCs w:val="22"/>
+          <w:lang w:val="nl-NL"/>
+        </w:rPr>
+        <w:t xml:space="preserve">. Hij voelde zich door de staat helemaal alleen gelaten. Noodgedwongen moest hij in ploegendienst werken en een paar jaar later kwam hij </w:t>
+      </w:r>
+      <w:r>
+        <w:rPr>
+          <w:rFonts w:ascii="Courier New" w:hAnsi="Courier New" w:cs="Courier New"/>
+          <w:sz w:val="22"/>
+          <w:szCs w:val="22"/>
+          <w:lang w:val="nl-NL"/>
+        </w:rPr>
+        <w:t>vanwege</w:t>
+      </w:r>
+      <w:r>
+        <w:rPr>
+          <w:rFonts w:ascii="Courier New" w:hAnsi="Courier New" w:cs="Courier New"/>
+          <w:sz w:val="22"/>
+          <w:szCs w:val="22"/>
+          <w:lang w:val="nl-NL"/>
+        </w:rPr>
+        <w:t xml:space="preserve"> medische redenen nog in de zorg terecht. Toen was de afstand tot de politiek al heel groot geworden en </w:t>
+      </w:r>
+      <w:r>
+        <w:rPr>
+          <w:rFonts w:ascii="Courier New" w:hAnsi="Courier New" w:cs="Courier New"/>
+          <w:sz w:val="22"/>
+          <w:szCs w:val="22"/>
+          <w:lang w:val="nl-NL"/>
+        </w:rPr>
+        <w:t xml:space="preserve">was hij </w:t>
+      </w:r>
+      <w:r>
+        <w:rPr>
+          <w:rFonts w:ascii="Courier New" w:hAnsi="Courier New" w:cs="Courier New"/>
+          <w:sz w:val="22"/>
+          <w:szCs w:val="22"/>
+          <w:lang w:val="nl-NL"/>
+        </w:rPr>
+        <w:t>over</w:t>
       </w:r>
       <w:r>
         <w:rPr>
@@ -264,7 +369,43 @@
           <w:szCs w:val="22"/>
           <w:lang w:val="nl-NL"/>
         </w:rPr>
-        <w:t xml:space="preserve"> van het CDA via Fortuin naar de partij van Wilders, ook om het CDA een lesje te leren. Hij voelde zich in de steek gelaten en hij was niet de enige, schrijft De Vries in dit prachtige boek. Zij is ervan overtuigd dat alles wat er in de politiek is gebeurd de laatste jaren niet is te begrijpen zonder het verhaal van mensen zoals haar vader die losgelaten zijn door de overheid. Wat haar vader wilde was erkenning als burger en </w:t>
+        <w:t xml:space="preserve"> van het CDA via Fortuin naar de partij van Wilders, ook om het CDA een lesje te leren. Hij voelde zich in de steek gelaten en hij was niet de enige, schrijft De Vries in dit prachtige boek. </w:t>
+      </w:r>
+      <w:r>
+        <w:rPr>
+          <w:rFonts w:ascii="Courier New" w:hAnsi="Courier New" w:cs="Courier New"/>
+          <w:sz w:val="22"/>
+          <w:szCs w:val="22"/>
+          <w:lang w:val="nl-NL"/>
+        </w:rPr>
+        <w:t>De Vries</w:t>
+      </w:r>
+      <w:r>
+        <w:rPr>
+          <w:rFonts w:ascii="Courier New" w:hAnsi="Courier New" w:cs="Courier New"/>
+          <w:sz w:val="22"/>
+          <w:szCs w:val="22"/>
+          <w:lang w:val="nl-NL"/>
+        </w:rPr>
+        <w:t xml:space="preserve"> is ervan overtuigd dat alles wat er in de politiek is gebeurd de laatste jaren niet is te begrijpen zonder het verhaal van mensen zoals </w:t>
+      </w:r>
+      <w:r>
+        <w:rPr>
+          <w:rFonts w:ascii="Courier New" w:hAnsi="Courier New" w:cs="Courier New"/>
+          <w:sz w:val="22"/>
+          <w:szCs w:val="22"/>
+          <w:lang w:val="nl-NL"/>
+        </w:rPr>
+        <w:t xml:space="preserve">dat van </w:t>
+      </w:r>
+      <w:r>
+        <w:rPr>
+          <w:rFonts w:ascii="Courier New" w:hAnsi="Courier New" w:cs="Courier New"/>
+          <w:sz w:val="22"/>
+          <w:szCs w:val="22"/>
+          <w:lang w:val="nl-NL"/>
+        </w:rPr>
+        <w:t xml:space="preserve">haar vader. Wat haar vader wilde was erkenning als burger en </w:t>
       </w:r>
       <w:r>
         <w:rPr>
@@ -282,7 +423,52 @@
           <w:szCs w:val="22"/>
           <w:lang w:val="nl-NL"/>
         </w:rPr>
-        <w:t xml:space="preserve">Het verhaal van haar vader is het verhaal wat er in Duitsland, Verenigd Koninkrijk, Italië en Nederland zelf is gebeurd. </w:t>
+        <w:t xml:space="preserve">Zijn </w:t>
+      </w:r>
+      <w:r>
+        <w:rPr>
+          <w:rFonts w:ascii="Courier New" w:hAnsi="Courier New" w:cs="Courier New"/>
+          <w:sz w:val="22"/>
+          <w:szCs w:val="22"/>
+          <w:lang w:val="nl-NL"/>
+        </w:rPr>
+        <w:t xml:space="preserve">is het verhaal </w:t>
+      </w:r>
+      <w:r>
+        <w:rPr>
+          <w:rFonts w:ascii="Courier New" w:hAnsi="Courier New" w:cs="Courier New"/>
+          <w:sz w:val="22"/>
+          <w:szCs w:val="22"/>
+          <w:lang w:val="nl-NL"/>
+        </w:rPr>
+        <w:t xml:space="preserve">van </w:t>
+      </w:r>
+      <w:r>
+        <w:rPr>
+          <w:rFonts w:ascii="Courier New" w:hAnsi="Courier New" w:cs="Courier New"/>
+          <w:sz w:val="22"/>
+          <w:szCs w:val="22"/>
+          <w:lang w:val="nl-NL"/>
+        </w:rPr>
+        <w:t>wat er in Duitsland, Verenigd Koninkrijk, Italië</w:t>
+      </w:r>
+      <w:r>
+        <w:rPr>
+          <w:rFonts w:ascii="Courier New" w:hAnsi="Courier New" w:cs="Courier New"/>
+          <w:sz w:val="22"/>
+          <w:szCs w:val="22"/>
+          <w:lang w:val="nl-NL"/>
+        </w:rPr>
+        <w:t>, Frankrijk</w:t>
+      </w:r>
+      <w:r>
+        <w:rPr>
+          <w:rFonts w:ascii="Courier New" w:hAnsi="Courier New" w:cs="Courier New"/>
+          <w:sz w:val="22"/>
+          <w:szCs w:val="22"/>
+          <w:lang w:val="nl-NL"/>
+        </w:rPr>
+        <w:t xml:space="preserve"> en Nederland zelf is gebeurd. </w:t>
       </w:r>
     </w:p>
     <w:p>
@@ -321,61 +507,97 @@
           <w:szCs w:val="22"/>
           <w:lang w:val="nl-NL"/>
         </w:rPr>
-        <w:t xml:space="preserve"> dat er zoveel wantrouwen en gevoel van verlies is ontstaan. Hoe kan dat nou en wat is hier gebeurd? Na de Tweede Wereldoorlog is er Nederland een heel goed netwerk van publieke voorzieningen opgebouwd, met goed openbaar vervoer, netwerk van huisartsen en scholen en bibliotheken voor iedereen. Daar betaalden </w:t>
-      </w:r>
-      <w:r>
-        <w:rPr>
-          <w:rFonts w:ascii="Courier New" w:hAnsi="Courier New" w:cs="Courier New"/>
-          <w:sz w:val="22"/>
-          <w:szCs w:val="22"/>
-          <w:lang w:val="nl-NL"/>
-        </w:rPr>
-        <w:t xml:space="preserve">de mensen </w:t>
-      </w:r>
-      <w:r>
-        <w:rPr>
-          <w:rFonts w:ascii="Courier New" w:hAnsi="Courier New" w:cs="Courier New"/>
-          <w:sz w:val="22"/>
-          <w:szCs w:val="22"/>
-          <w:lang w:val="nl-NL"/>
-        </w:rPr>
-        <w:t xml:space="preserve">belasting voor </w:t>
-      </w:r>
-      <w:r>
-        <w:rPr>
-          <w:rFonts w:ascii="Courier New" w:hAnsi="Courier New" w:cs="Courier New"/>
-          <w:sz w:val="22"/>
-          <w:szCs w:val="22"/>
-          <w:lang w:val="nl-NL"/>
-        </w:rPr>
-        <w:t xml:space="preserve">en </w:t>
-      </w:r>
-      <w:r>
-        <w:rPr>
-          <w:rFonts w:ascii="Courier New" w:hAnsi="Courier New" w:cs="Courier New"/>
-          <w:sz w:val="22"/>
-          <w:szCs w:val="22"/>
-          <w:lang w:val="nl-NL"/>
-        </w:rPr>
-        <w:t>daar kregen</w:t>
-      </w:r>
-      <w:r>
-        <w:rPr>
-          <w:rFonts w:ascii="Courier New" w:hAnsi="Courier New" w:cs="Courier New"/>
-          <w:sz w:val="22"/>
-          <w:szCs w:val="22"/>
-          <w:lang w:val="nl-NL"/>
-        </w:rPr>
-        <w:t xml:space="preserve"> ze veel </w:t>
-      </w:r>
-      <w:r>
-        <w:rPr>
-          <w:rFonts w:ascii="Courier New" w:hAnsi="Courier New" w:cs="Courier New"/>
-          <w:sz w:val="22"/>
-          <w:szCs w:val="22"/>
-          <w:lang w:val="nl-NL"/>
-        </w:rPr>
-        <w:t xml:space="preserve">voor terug. Die publieke voorzieningen verschraalden in de jaren tachtig wanneer er minder geld voor is, de afstand tot die voorzieningen toenemen voor veel mensen, de kwaliteit inboet, de toegankelijkheid afneemt en de belangstelling vanuit de overheid hiervoor afneemt. </w:t>
+        <w:t xml:space="preserve"> dat er zoveel wantrouwen en gevoel van verlies is ontstaan. Hoe kan dat en wat is hier gebeurd? Na de Tweede Wereldoorlog is er Nederland een</w:t>
+      </w:r>
+      <w:r>
+        <w:rPr>
+          <w:rFonts w:ascii="Courier New" w:hAnsi="Courier New" w:cs="Courier New"/>
+          <w:sz w:val="22"/>
+          <w:szCs w:val="22"/>
+          <w:lang w:val="nl-NL"/>
+        </w:rPr>
+        <w:t xml:space="preserve"> stevig</w:t>
+      </w:r>
+      <w:r>
+        <w:rPr>
+          <w:rFonts w:ascii="Courier New" w:hAnsi="Courier New" w:cs="Courier New"/>
+          <w:sz w:val="22"/>
+          <w:szCs w:val="22"/>
+          <w:lang w:val="nl-NL"/>
+        </w:rPr>
+        <w:t xml:space="preserve"> netwerk van publieke voorzieningen opgebouwd, met goed openbaar vervoer, huisartsen en scholen en bibliotheken voor iedereen. </w:t>
+      </w:r>
+      <w:r>
+        <w:rPr>
+          <w:rFonts w:ascii="Courier New" w:hAnsi="Courier New" w:cs="Courier New"/>
+          <w:sz w:val="22"/>
+          <w:szCs w:val="22"/>
+          <w:lang w:val="nl-NL"/>
+        </w:rPr>
+        <w:t>Voor de belasting die ze betaalden</w:t>
+      </w:r>
+      <w:r>
+        <w:rPr>
+          <w:rFonts w:ascii="Courier New" w:hAnsi="Courier New" w:cs="Courier New"/>
+          <w:sz w:val="22"/>
+          <w:szCs w:val="22"/>
+          <w:lang w:val="nl-NL"/>
+        </w:rPr>
+        <w:t xml:space="preserve"> kregen</w:t>
+      </w:r>
+      <w:r>
+        <w:rPr>
+          <w:rFonts w:ascii="Courier New" w:hAnsi="Courier New" w:cs="Courier New"/>
+          <w:sz w:val="22"/>
+          <w:szCs w:val="22"/>
+          <w:lang w:val="nl-NL"/>
+        </w:rPr>
+        <w:t xml:space="preserve"> ze veel</w:t>
+      </w:r>
+      <w:r>
+        <w:rPr>
+          <w:rFonts w:ascii="Courier New" w:hAnsi="Courier New" w:cs="Courier New"/>
+          <w:sz w:val="22"/>
+          <w:szCs w:val="22"/>
+          <w:lang w:val="nl-NL"/>
+        </w:rPr>
+        <w:t xml:space="preserve"> terug. Die publieke voorzieningen verschraalden in de jaren tachtig wanneer er minder geld voor is, de afstand </w:t>
+      </w:r>
+      <w:r>
+        <w:rPr>
+          <w:rFonts w:ascii="Courier New" w:hAnsi="Courier New" w:cs="Courier New"/>
+          <w:sz w:val="22"/>
+          <w:szCs w:val="22"/>
+          <w:lang w:val="nl-NL"/>
+        </w:rPr>
+        <w:t xml:space="preserve">ertoe </w:t>
+      </w:r>
+      <w:r>
+        <w:rPr>
+          <w:rFonts w:ascii="Courier New" w:hAnsi="Courier New" w:cs="Courier New"/>
+          <w:sz w:val="22"/>
+          <w:szCs w:val="22"/>
+          <w:lang w:val="nl-NL"/>
+        </w:rPr>
+        <w:t>toene</w:t>
+      </w:r>
+      <w:r>
+        <w:rPr>
+          <w:rFonts w:ascii="Courier New" w:hAnsi="Courier New" w:cs="Courier New"/>
+          <w:sz w:val="22"/>
+          <w:szCs w:val="22"/>
+          <w:lang w:val="nl-NL"/>
+        </w:rPr>
+        <w:t>emt</w:t>
+      </w:r>
+      <w:r>
+        <w:rPr>
+          <w:rFonts w:ascii="Courier New" w:hAnsi="Courier New" w:cs="Courier New"/>
+          <w:sz w:val="22"/>
+          <w:szCs w:val="22"/>
+          <w:lang w:val="nl-NL"/>
+        </w:rPr>
+        <w:t xml:space="preserve"> voor veel mensen, de kwaliteit inboet, de toegankelijkheid afneemt en de belangstelling vanuit de overheid hiervoor afneemt. </w:t>
       </w:r>
       <w:r>
         <w:rPr>
@@ -402,7 +624,25 @@
           <w:szCs w:val="22"/>
           <w:lang w:val="nl-NL"/>
         </w:rPr>
-        <w:t xml:space="preserve"> geïnvesteerd in zorg, </w:t>
+        <w:t xml:space="preserve"> geïnvesteerd in zorg, huisvesting, onderwijs en infrastructuur</w:t>
+      </w:r>
+      <w:r>
+        <w:rPr>
+          <w:rFonts w:ascii="Courier New" w:hAnsi="Courier New" w:cs="Courier New"/>
+          <w:sz w:val="22"/>
+          <w:szCs w:val="22"/>
+          <w:lang w:val="nl-NL"/>
+        </w:rPr>
+        <w:t xml:space="preserve"> en e</w:t>
+      </w:r>
+      <w:r>
+        <w:rPr>
+          <w:rFonts w:ascii="Courier New" w:hAnsi="Courier New" w:cs="Courier New"/>
+          <w:sz w:val="22"/>
+          <w:szCs w:val="22"/>
+          <w:lang w:val="nl-NL"/>
+        </w:rPr>
+        <w:t xml:space="preserve">r </w:t>
       </w:r>
       <w:r>
         <w:rPr>
@@ -412,25 +652,7 @@
           <w:lang w:val="nl-NL"/>
         </w:rPr>
         <w:lastRenderedPageBreak/>
-        <w:t>huisvesting, onderwijs en duurzame infrastructuur</w:t>
-      </w:r>
-      <w:r>
-        <w:rPr>
-          <w:rFonts w:ascii="Courier New" w:hAnsi="Courier New" w:cs="Courier New"/>
-          <w:sz w:val="22"/>
-          <w:szCs w:val="22"/>
-          <w:lang w:val="nl-NL"/>
-        </w:rPr>
-        <w:t xml:space="preserve"> en e</w:t>
-      </w:r>
-      <w:r>
-        <w:rPr>
-          <w:rFonts w:ascii="Courier New" w:hAnsi="Courier New" w:cs="Courier New"/>
-          <w:sz w:val="22"/>
-          <w:szCs w:val="22"/>
-          <w:lang w:val="nl-NL"/>
-        </w:rPr>
-        <w:t xml:space="preserve">r ontstaat materiële en morele ongelijkheid. Bepaalde groepen tellen minder mee en </w:t>
+        <w:t xml:space="preserve">ontstaat materiële en morele ongelijkheid. Bepaalde groepen tellen minder mee en </w:t>
       </w:r>
       <w:r>
         <w:rPr>
@@ -466,7 +688,7 @@
           <w:szCs w:val="22"/>
           <w:lang w:val="nl-NL"/>
         </w:rPr>
-        <w:t xml:space="preserve"> neergekeken. Er ontstaat grote onvrede en er worden andere politieke en ideologische keuzes gemaakt.</w:t>
+        <w:t xml:space="preserve"> neergekeken. Er ontstaat onvrede en er worden andere politieke en ideologische keuzes gemaakt.</w:t>
       </w:r>
       <w:r>
         <w:rPr>
@@ -577,205 +799,6 @@
           <w:lang w:val="nl-NL"/>
         </w:rPr>
         <w:tab/>
-        <w:t>In dat klimaat zijn er populistische partijen die wel raad weten met die onvrede</w:t>
-      </w:r>
-      <w:r>
-        <w:rPr>
-          <w:rFonts w:ascii="Courier New" w:hAnsi="Courier New" w:cs="Courier New"/>
-          <w:sz w:val="22"/>
-          <w:szCs w:val="22"/>
-          <w:lang w:val="nl-NL"/>
-        </w:rPr>
-        <w:t xml:space="preserve">, die het over ‘wij tegen zij’ hebben en die naar de migranten en de elite als zondebokken kijken. Dan zijn er politici die dit verhaal naar hun hand zetten en die er een eenvoudig verhaal </w:t>
-      </w:r>
-      <w:r>
-        <w:rPr>
-          <w:rFonts w:ascii="Courier New" w:hAnsi="Courier New" w:cs="Courier New"/>
-          <w:sz w:val="22"/>
-          <w:szCs w:val="22"/>
-          <w:lang w:val="nl-NL"/>
-        </w:rPr>
-        <w:t xml:space="preserve">met simpele oplossingen </w:t>
-      </w:r>
-      <w:r>
-        <w:rPr>
-          <w:rFonts w:ascii="Courier New" w:hAnsi="Courier New" w:cs="Courier New"/>
-          <w:sz w:val="22"/>
-          <w:szCs w:val="22"/>
-          <w:lang w:val="nl-NL"/>
-        </w:rPr>
-        <w:t>van maken. Het vertrouwen in de staat, instituties en politici brokkelt langzaam. A</w:t>
-      </w:r>
-      <w:r>
-        <w:rPr>
-          <w:rFonts w:ascii="Courier New" w:hAnsi="Courier New" w:cs="Courier New"/>
-          <w:sz w:val="22"/>
-          <w:szCs w:val="22"/>
-          <w:lang w:val="nl-NL"/>
-        </w:rPr>
-        <w:t xml:space="preserve">ndere partijen </w:t>
-      </w:r>
-      <w:r>
-        <w:rPr>
-          <w:rFonts w:ascii="Courier New" w:hAnsi="Courier New" w:cs="Courier New"/>
-          <w:sz w:val="22"/>
-          <w:szCs w:val="22"/>
-          <w:lang w:val="nl-NL"/>
-        </w:rPr>
-        <w:t xml:space="preserve">en media </w:t>
-      </w:r>
-      <w:r>
-        <w:rPr>
-          <w:rFonts w:ascii="Courier New" w:hAnsi="Courier New" w:cs="Courier New"/>
-          <w:sz w:val="22"/>
-          <w:szCs w:val="22"/>
-          <w:lang w:val="nl-NL"/>
-        </w:rPr>
-        <w:t>normaliseren</w:t>
-      </w:r>
-      <w:r>
-        <w:rPr>
-          <w:rFonts w:ascii="Courier New" w:hAnsi="Courier New" w:cs="Courier New"/>
-          <w:sz w:val="22"/>
-          <w:szCs w:val="22"/>
-          <w:lang w:val="nl-NL"/>
-        </w:rPr>
-        <w:t xml:space="preserve"> en versterken het verhaal</w:t>
-      </w:r>
-      <w:r>
-        <w:rPr>
-          <w:rFonts w:ascii="Courier New" w:hAnsi="Courier New" w:cs="Courier New"/>
-          <w:sz w:val="22"/>
-          <w:szCs w:val="22"/>
-          <w:lang w:val="nl-NL"/>
-        </w:rPr>
-        <w:t xml:space="preserve"> en </w:t>
-      </w:r>
-      <w:r>
-        <w:rPr>
-          <w:rFonts w:ascii="Courier New" w:hAnsi="Courier New" w:cs="Courier New"/>
-          <w:sz w:val="22"/>
-          <w:szCs w:val="22"/>
-          <w:lang w:val="nl-NL"/>
-        </w:rPr>
-        <w:t xml:space="preserve">het </w:t>
-      </w:r>
-      <w:r>
-        <w:rPr>
-          <w:rFonts w:ascii="Courier New" w:hAnsi="Courier New" w:cs="Courier New"/>
-          <w:sz w:val="22"/>
-          <w:szCs w:val="22"/>
-          <w:lang w:val="nl-NL"/>
-        </w:rPr>
-        <w:t xml:space="preserve">lijkt </w:t>
-      </w:r>
-      <w:r>
-        <w:rPr>
-          <w:rFonts w:ascii="Courier New" w:hAnsi="Courier New" w:cs="Courier New"/>
-          <w:sz w:val="22"/>
-          <w:szCs w:val="22"/>
-          <w:lang w:val="nl-NL"/>
-        </w:rPr>
-        <w:t>een verhaal van iedereen te worden.</w:t>
-      </w:r>
-      <w:r>
-        <w:rPr>
-          <w:rFonts w:ascii="Courier New" w:hAnsi="Courier New" w:cs="Courier New"/>
-          <w:sz w:val="22"/>
-          <w:szCs w:val="22"/>
-          <w:lang w:val="nl-NL"/>
-        </w:rPr>
-        <w:t xml:space="preserve"> </w:t>
-      </w:r>
-      <w:r>
-        <w:rPr>
-          <w:rFonts w:ascii="Courier New" w:hAnsi="Courier New" w:cs="Courier New"/>
-          <w:sz w:val="22"/>
-          <w:szCs w:val="22"/>
-          <w:lang w:val="nl-NL"/>
-        </w:rPr>
-        <w:t xml:space="preserve">Het </w:t>
-      </w:r>
-      <w:r>
-        <w:rPr>
-          <w:rFonts w:ascii="Courier New" w:hAnsi="Courier New" w:cs="Courier New"/>
-          <w:sz w:val="22"/>
-          <w:szCs w:val="22"/>
-          <w:lang w:val="nl-NL"/>
-        </w:rPr>
-        <w:t>is</w:t>
-      </w:r>
-      <w:r>
-        <w:rPr>
-          <w:rFonts w:ascii="Courier New" w:hAnsi="Courier New" w:cs="Courier New"/>
-          <w:sz w:val="22"/>
-          <w:szCs w:val="22"/>
-          <w:lang w:val="nl-NL"/>
-        </w:rPr>
-        <w:t xml:space="preserve"> het verhaal van verlies, achterstelling en onbehagen en van verbroken beloftes en geschonden verwachtingen</w:t>
-      </w:r>
-      <w:r>
-        <w:rPr>
-          <w:rFonts w:ascii="Courier New" w:hAnsi="Courier New" w:cs="Courier New"/>
-          <w:sz w:val="22"/>
-          <w:szCs w:val="22"/>
-          <w:lang w:val="nl-NL"/>
-        </w:rPr>
-        <w:t xml:space="preserve">. </w:t>
-      </w:r>
-      <w:r>
-        <w:rPr>
-          <w:rFonts w:ascii="Courier New" w:hAnsi="Courier New" w:cs="Courier New"/>
-          <w:sz w:val="22"/>
-          <w:szCs w:val="22"/>
-          <w:lang w:val="nl-NL"/>
-        </w:rPr>
-        <w:t xml:space="preserve">De gemeenschap als geheel lijdt eronder. </w:t>
-      </w:r>
-      <w:r>
-        <w:rPr>
-          <w:rFonts w:ascii="Courier New" w:hAnsi="Courier New" w:cs="Courier New"/>
-          <w:sz w:val="22"/>
-          <w:szCs w:val="22"/>
-          <w:lang w:val="nl-NL"/>
-        </w:rPr>
-        <w:t xml:space="preserve">Alles wat er tegelijkertijd gebeurt </w:t>
-      </w:r>
-      <w:r>
-        <w:rPr>
-          <w:rFonts w:ascii="Courier New" w:hAnsi="Courier New" w:cs="Courier New"/>
-          <w:sz w:val="22"/>
-          <w:szCs w:val="22"/>
-          <w:lang w:val="nl-NL"/>
-        </w:rPr>
-        <w:t xml:space="preserve">zoals </w:t>
-      </w:r>
-      <w:r>
-        <w:rPr>
-          <w:rFonts w:ascii="Courier New" w:hAnsi="Courier New" w:cs="Courier New"/>
-          <w:sz w:val="22"/>
-          <w:szCs w:val="22"/>
-          <w:lang w:val="nl-NL"/>
-        </w:rPr>
-        <w:t>marktwerking, globalisering, vergrijzing en beleidskeuzen die worden gemaakt, word</w:t>
-      </w:r>
-      <w:r>
-        <w:rPr>
-          <w:rFonts w:ascii="Courier New" w:hAnsi="Courier New" w:cs="Courier New"/>
-          <w:sz w:val="22"/>
-          <w:szCs w:val="22"/>
-          <w:lang w:val="nl-NL"/>
-        </w:rPr>
-        <w:t>t</w:t>
-      </w:r>
-      <w:r>
-        <w:rPr>
-          <w:rFonts w:ascii="Courier New" w:hAnsi="Courier New" w:cs="Courier New"/>
-          <w:sz w:val="22"/>
-          <w:szCs w:val="22"/>
-          <w:lang w:val="nl-NL"/>
-        </w:rPr>
-        <w:t xml:space="preserve"> gereduceerd tot ‘wat van ons is nemen ze af’. </w:t>
       </w:r>
     </w:p>
     <w:p>
@@ -799,10 +822,326 @@
           <w:lang w:val="nl-NL"/>
         </w:rPr>
       </w:pPr>
+      <w:r>
+        <w:rPr>
+          <w:rFonts w:ascii="Courier New" w:hAnsi="Courier New" w:cs="Courier New"/>
+          <w:sz w:val="22"/>
+          <w:szCs w:val="22"/>
+          <w:lang w:val="nl-NL"/>
+        </w:rPr>
+        <w:t>In dat klimaat zijn er populistische partijen die wel raad weten met die onvrede</w:t>
+      </w:r>
+      <w:r>
+        <w:rPr>
+          <w:rFonts w:ascii="Courier New" w:hAnsi="Courier New" w:cs="Courier New"/>
+          <w:sz w:val="22"/>
+          <w:szCs w:val="22"/>
+          <w:lang w:val="nl-NL"/>
+        </w:rPr>
+        <w:t xml:space="preserve">. Zij hebben het </w:t>
+      </w:r>
+      <w:r>
+        <w:rPr>
+          <w:rFonts w:ascii="Courier New" w:hAnsi="Courier New" w:cs="Courier New"/>
+          <w:sz w:val="22"/>
+          <w:szCs w:val="22"/>
+          <w:lang w:val="nl-NL"/>
+        </w:rPr>
+        <w:t xml:space="preserve">over ‘wij tegen zij’ en </w:t>
+      </w:r>
+      <w:r>
+        <w:rPr>
+          <w:rFonts w:ascii="Courier New" w:hAnsi="Courier New" w:cs="Courier New"/>
+          <w:sz w:val="22"/>
+          <w:szCs w:val="22"/>
+          <w:lang w:val="nl-NL"/>
+        </w:rPr>
+        <w:t>bestempelen</w:t>
+      </w:r>
+      <w:r>
+        <w:rPr>
+          <w:rFonts w:ascii="Courier New" w:hAnsi="Courier New" w:cs="Courier New"/>
+          <w:sz w:val="22"/>
+          <w:szCs w:val="22"/>
+          <w:lang w:val="nl-NL"/>
+        </w:rPr>
+        <w:t xml:space="preserve"> de migranten en de elite als zondebokken. </w:t>
+      </w:r>
+      <w:r>
+        <w:rPr>
+          <w:rFonts w:ascii="Courier New" w:hAnsi="Courier New" w:cs="Courier New"/>
+          <w:sz w:val="22"/>
+          <w:szCs w:val="22"/>
+          <w:lang w:val="nl-NL"/>
+        </w:rPr>
+        <w:t>Er komen</w:t>
+      </w:r>
+      <w:r>
+        <w:rPr>
+          <w:rFonts w:ascii="Courier New" w:hAnsi="Courier New" w:cs="Courier New"/>
+          <w:sz w:val="22"/>
+          <w:szCs w:val="22"/>
+          <w:lang w:val="nl-NL"/>
+        </w:rPr>
+        <w:t xml:space="preserve"> politici die dit verhaal naar hun hand zetten en die er een eenvoudig verhaal </w:t>
+      </w:r>
+      <w:r>
+        <w:rPr>
+          <w:rFonts w:ascii="Courier New" w:hAnsi="Courier New" w:cs="Courier New"/>
+          <w:sz w:val="22"/>
+          <w:szCs w:val="22"/>
+          <w:lang w:val="nl-NL"/>
+        </w:rPr>
+        <w:t xml:space="preserve">met simpele oplossingen </w:t>
+      </w:r>
+      <w:r>
+        <w:rPr>
+          <w:rFonts w:ascii="Courier New" w:hAnsi="Courier New" w:cs="Courier New"/>
+          <w:sz w:val="22"/>
+          <w:szCs w:val="22"/>
+          <w:lang w:val="nl-NL"/>
+        </w:rPr>
+        <w:t>van maken. Het vertrouwen in de staat, instituties en politici brokkelt langzaam. A</w:t>
+      </w:r>
+      <w:r>
+        <w:rPr>
+          <w:rFonts w:ascii="Courier New" w:hAnsi="Courier New" w:cs="Courier New"/>
+          <w:sz w:val="22"/>
+          <w:szCs w:val="22"/>
+          <w:lang w:val="nl-NL"/>
+        </w:rPr>
+        <w:t xml:space="preserve">ndere partijen </w:t>
+      </w:r>
+      <w:r>
+        <w:rPr>
+          <w:rFonts w:ascii="Courier New" w:hAnsi="Courier New" w:cs="Courier New"/>
+          <w:sz w:val="22"/>
+          <w:szCs w:val="22"/>
+          <w:lang w:val="nl-NL"/>
+        </w:rPr>
+        <w:t xml:space="preserve">en media </w:t>
+      </w:r>
+      <w:r>
+        <w:rPr>
+          <w:rFonts w:ascii="Courier New" w:hAnsi="Courier New" w:cs="Courier New"/>
+          <w:sz w:val="22"/>
+          <w:szCs w:val="22"/>
+          <w:lang w:val="nl-NL"/>
+        </w:rPr>
+        <w:t>normaliseren</w:t>
+      </w:r>
+      <w:r>
+        <w:rPr>
+          <w:rFonts w:ascii="Courier New" w:hAnsi="Courier New" w:cs="Courier New"/>
+          <w:sz w:val="22"/>
+          <w:szCs w:val="22"/>
+          <w:lang w:val="nl-NL"/>
+        </w:rPr>
+        <w:t xml:space="preserve"> en versterken het </w:t>
+      </w:r>
+      <w:r>
+        <w:rPr>
+          <w:rFonts w:ascii="Courier New" w:hAnsi="Courier New" w:cs="Courier New"/>
+          <w:sz w:val="22"/>
+          <w:szCs w:val="22"/>
+          <w:lang w:val="nl-NL"/>
+        </w:rPr>
+        <w:t xml:space="preserve">treurige </w:t>
+      </w:r>
+      <w:r>
+        <w:rPr>
+          <w:rFonts w:ascii="Courier New" w:hAnsi="Courier New" w:cs="Courier New"/>
+          <w:sz w:val="22"/>
+          <w:szCs w:val="22"/>
+          <w:lang w:val="nl-NL"/>
+        </w:rPr>
+        <w:t>verhaal</w:t>
+      </w:r>
+      <w:r>
+        <w:rPr>
+          <w:rFonts w:ascii="Courier New" w:hAnsi="Courier New" w:cs="Courier New"/>
+          <w:sz w:val="22"/>
+          <w:szCs w:val="22"/>
+          <w:lang w:val="nl-NL"/>
+        </w:rPr>
+        <w:t xml:space="preserve"> </w:t>
+      </w:r>
+      <w:r>
+        <w:rPr>
+          <w:rFonts w:ascii="Courier New" w:hAnsi="Courier New" w:cs="Courier New"/>
+          <w:sz w:val="22"/>
+          <w:szCs w:val="22"/>
+          <w:lang w:val="nl-NL"/>
+        </w:rPr>
+        <w:t>wordt</w:t>
+      </w:r>
+      <w:r>
+        <w:rPr>
+          <w:rFonts w:ascii="Courier New" w:hAnsi="Courier New" w:cs="Courier New"/>
+          <w:sz w:val="22"/>
+          <w:szCs w:val="22"/>
+          <w:lang w:val="nl-NL"/>
+        </w:rPr>
+        <w:t xml:space="preserve"> </w:t>
+      </w:r>
+      <w:r>
+        <w:rPr>
+          <w:rFonts w:ascii="Courier New" w:hAnsi="Courier New" w:cs="Courier New"/>
+          <w:sz w:val="22"/>
+          <w:szCs w:val="22"/>
+          <w:lang w:val="nl-NL"/>
+        </w:rPr>
+        <w:t>een verhaal van iedereen.</w:t>
+      </w:r>
+      <w:r>
+        <w:rPr>
+          <w:rFonts w:ascii="Courier New" w:hAnsi="Courier New" w:cs="Courier New"/>
+          <w:sz w:val="22"/>
+          <w:szCs w:val="22"/>
+          <w:lang w:val="nl-NL"/>
+        </w:rPr>
+        <w:t xml:space="preserve"> </w:t>
+      </w:r>
+      <w:r>
+        <w:rPr>
+          <w:rFonts w:ascii="Courier New" w:hAnsi="Courier New" w:cs="Courier New"/>
+          <w:sz w:val="22"/>
+          <w:szCs w:val="22"/>
+          <w:lang w:val="nl-NL"/>
+        </w:rPr>
+        <w:t>Dat gaat over</w:t>
+      </w:r>
+      <w:r>
+        <w:rPr>
+          <w:rFonts w:ascii="Courier New" w:hAnsi="Courier New" w:cs="Courier New"/>
+          <w:sz w:val="22"/>
+          <w:szCs w:val="22"/>
+          <w:lang w:val="nl-NL"/>
+        </w:rPr>
+        <w:t xml:space="preserve"> </w:t>
+      </w:r>
+      <w:r>
+        <w:rPr>
+          <w:rFonts w:ascii="Courier New" w:hAnsi="Courier New" w:cs="Courier New"/>
+          <w:sz w:val="22"/>
+          <w:szCs w:val="22"/>
+          <w:lang w:val="nl-NL"/>
+        </w:rPr>
+        <w:t>verlies, achterstelling en onbehagen e</w:t>
+      </w:r>
+      <w:r>
+        <w:rPr>
+          <w:rFonts w:ascii="Courier New" w:hAnsi="Courier New" w:cs="Courier New"/>
+          <w:sz w:val="22"/>
+          <w:szCs w:val="22"/>
+          <w:lang w:val="nl-NL"/>
+        </w:rPr>
+        <w:t xml:space="preserve">n over </w:t>
+      </w:r>
+      <w:r>
+        <w:rPr>
+          <w:rFonts w:ascii="Courier New" w:hAnsi="Courier New" w:cs="Courier New"/>
+          <w:sz w:val="22"/>
+          <w:szCs w:val="22"/>
+          <w:lang w:val="nl-NL"/>
+        </w:rPr>
+        <w:t>verbroken beloftes en geschonden verwachtingen</w:t>
+      </w:r>
+      <w:r>
+        <w:rPr>
+          <w:rFonts w:ascii="Courier New" w:hAnsi="Courier New" w:cs="Courier New"/>
+          <w:sz w:val="22"/>
+          <w:szCs w:val="22"/>
+          <w:lang w:val="nl-NL"/>
+        </w:rPr>
+        <w:t xml:space="preserve">. </w:t>
+      </w:r>
+      <w:r>
+        <w:rPr>
+          <w:rFonts w:ascii="Courier New" w:hAnsi="Courier New" w:cs="Courier New"/>
+          <w:sz w:val="22"/>
+          <w:szCs w:val="22"/>
+          <w:lang w:val="nl-NL"/>
+        </w:rPr>
+        <w:t xml:space="preserve">De gemeenschap als geheel lijdt eronder. </w:t>
+      </w:r>
+      <w:r>
+        <w:rPr>
+          <w:rFonts w:ascii="Courier New" w:hAnsi="Courier New" w:cs="Courier New"/>
+          <w:sz w:val="22"/>
+          <w:szCs w:val="22"/>
+          <w:lang w:val="nl-NL"/>
+        </w:rPr>
+        <w:t>Alles wat er tegelijkertijd gebeurt</w:t>
+      </w:r>
+      <w:r>
+        <w:rPr>
+          <w:rFonts w:ascii="Courier New" w:hAnsi="Courier New" w:cs="Courier New"/>
+          <w:sz w:val="22"/>
+          <w:szCs w:val="22"/>
+          <w:lang w:val="nl-NL"/>
+        </w:rPr>
+        <w:t xml:space="preserve"> (</w:t>
+      </w:r>
+      <w:r>
+        <w:rPr>
+          <w:rFonts w:ascii="Courier New" w:hAnsi="Courier New" w:cs="Courier New"/>
+          <w:sz w:val="22"/>
+          <w:szCs w:val="22"/>
+          <w:lang w:val="nl-NL"/>
+        </w:rPr>
+        <w:t xml:space="preserve">zoals </w:t>
+      </w:r>
+      <w:r>
+        <w:rPr>
+          <w:rFonts w:ascii="Courier New" w:hAnsi="Courier New" w:cs="Courier New"/>
+          <w:sz w:val="22"/>
+          <w:szCs w:val="22"/>
+          <w:lang w:val="nl-NL"/>
+        </w:rPr>
+        <w:t>marktwerking, globalisering, vergrijzing en beleidskeuzen die worden gemaakt</w:t>
+      </w:r>
+      <w:r>
+        <w:rPr>
+          <w:rFonts w:ascii="Courier New" w:hAnsi="Courier New" w:cs="Courier New"/>
+          <w:sz w:val="22"/>
+          <w:szCs w:val="22"/>
+          <w:lang w:val="nl-NL"/>
+        </w:rPr>
+        <w:t>)</w:t>
+      </w:r>
+      <w:r>
+        <w:rPr>
+          <w:rFonts w:ascii="Courier New" w:hAnsi="Courier New" w:cs="Courier New"/>
+          <w:sz w:val="22"/>
+          <w:szCs w:val="22"/>
+          <w:lang w:val="nl-NL"/>
+        </w:rPr>
+        <w:t xml:space="preserve"> word</w:t>
+      </w:r>
+      <w:r>
+        <w:rPr>
+          <w:rFonts w:ascii="Courier New" w:hAnsi="Courier New" w:cs="Courier New"/>
+          <w:sz w:val="22"/>
+          <w:szCs w:val="22"/>
+          <w:lang w:val="nl-NL"/>
+        </w:rPr>
+        <w:t>t</w:t>
+      </w:r>
+      <w:r>
+        <w:rPr>
+          <w:rFonts w:ascii="Courier New" w:hAnsi="Courier New" w:cs="Courier New"/>
+          <w:sz w:val="22"/>
+          <w:szCs w:val="22"/>
+          <w:lang w:val="nl-NL"/>
+        </w:rPr>
+        <w:t xml:space="preserve"> gereduceerd tot ‘wat van ons is nemen ze af’. </w:t>
+      </w:r>
     </w:p>
     <w:p>
       <w:pPr>
         <w:spacing w:line="360" w:lineRule="auto"/>
+        <w:ind w:firstLine="720"/>
         <w:rPr>
           <w:rFonts w:ascii="Courier New" w:hAnsi="Courier New" w:cs="Courier New"/>
           <w:sz w:val="22"/>
@@ -826,7 +1165,25 @@
           <w:szCs w:val="22"/>
           <w:lang w:val="nl-NL"/>
         </w:rPr>
-        <w:t xml:space="preserve">Duitsland, Engeland, Italië, Frankrijk en Nederland. In die landen studeert en werkt ze al sociaal wetenschapper die empirisch onderzoek doet naar deze sociale ontwikkelingen. In Duitsland raakt ze in 1999 betrokken bij een onderzoek naar de sociale en politieke gevolgen van de Duitse eenwording gedurende de afgelopen tien jaar. In de jaren negentig was de nadruk op bezuinigen en budgetdiscipline komen te liggen. Economisch deed het land het goed maar de maatregelen had een hoge sociale prijs waar met name mensen uit het oosten een gevoel van verlies en achterstelling ervaren. Scholen, ziekenhuizen en treinstations worden gesloten </w:t>
+        <w:t>Duitsland, Engeland, Italië, Frankrijk en Nederland. In die landen studeert en werkt ze al</w:t>
+      </w:r>
+      <w:r>
+        <w:rPr>
+          <w:rFonts w:ascii="Courier New" w:hAnsi="Courier New" w:cs="Courier New"/>
+          <w:sz w:val="22"/>
+          <w:szCs w:val="22"/>
+          <w:lang w:val="nl-NL"/>
+        </w:rPr>
+        <w:t>s</w:t>
+      </w:r>
+      <w:r>
+        <w:rPr>
+          <w:rFonts w:ascii="Courier New" w:hAnsi="Courier New" w:cs="Courier New"/>
+          <w:sz w:val="22"/>
+          <w:szCs w:val="22"/>
+          <w:lang w:val="nl-NL"/>
+        </w:rPr>
+        <w:t xml:space="preserve"> sociaal wetenschapper die empirisch onderzoek doet naar deze sociale ontwikkelingen. In Duitsland raakt ze in 1999 betrokken bij een onderzoek naar de sociale en politieke gevolgen van de Duitse eenwording gedurende de afgelopen tien jaar. In de jaren negentig was de nadruk op bezuinigen en budgetdiscipline komen te liggen. Economisch deed het land het goed maar de maatregelen had een hoge sociale prijs waar met name mensen uit het oosten een gevoel van verlies en achterstelling ervaren. Scholen, ziekenhuizen en treinstations worden gesloten </w:t>
       </w:r>
       <w:r>
         <w:rPr>
@@ -844,7 +1201,54 @@
           <w:szCs w:val="22"/>
           <w:lang w:val="nl-NL"/>
         </w:rPr>
-        <w:t xml:space="preserve">en </w:t>
+        <w:t xml:space="preserve">en op het leven van de </w:t>
+      </w:r>
+      <w:r>
+        <w:rPr>
+          <w:rFonts w:ascii="Courier New" w:hAnsi="Courier New" w:cs="Courier New"/>
+          <w:sz w:val="22"/>
+          <w:szCs w:val="22"/>
+          <w:lang w:val="nl-NL"/>
+        </w:rPr>
+        <w:t>‘</w:t>
+      </w:r>
+      <w:proofErr w:type="spellStart"/>
+      <w:r>
+        <w:rPr>
+          <w:rFonts w:ascii="Courier New" w:hAnsi="Courier New" w:cs="Courier New"/>
+          <w:sz w:val="22"/>
+          <w:szCs w:val="22"/>
+          <w:lang w:val="nl-NL"/>
+        </w:rPr>
+        <w:t>Ossies</w:t>
+      </w:r>
+      <w:proofErr w:type="spellEnd"/>
+      <w:r>
+        <w:rPr>
+          <w:rFonts w:ascii="Courier New" w:hAnsi="Courier New" w:cs="Courier New"/>
+          <w:sz w:val="22"/>
+          <w:szCs w:val="22"/>
+          <w:lang w:val="nl-NL"/>
+        </w:rPr>
+        <w:t>’</w:t>
+      </w:r>
+      <w:r>
+        <w:rPr>
+          <w:rFonts w:ascii="Courier New" w:hAnsi="Courier New" w:cs="Courier New"/>
+          <w:sz w:val="22"/>
+          <w:szCs w:val="22"/>
+          <w:lang w:val="nl-NL"/>
+        </w:rPr>
+        <w:t xml:space="preserve"> wordt neergekeken. </w:t>
+      </w:r>
+      <w:r>
+        <w:rPr>
+          <w:rFonts w:ascii="Courier New" w:hAnsi="Courier New" w:cs="Courier New"/>
+          <w:sz w:val="22"/>
+          <w:szCs w:val="22"/>
+          <w:lang w:val="nl-NL"/>
+        </w:rPr>
+        <w:t xml:space="preserve">Modernisering en rationalisering wordt door de mensen zelf als afbraak ervaren. Het </w:t>
       </w:r>
       <w:r>
         <w:rPr>
@@ -854,36 +1258,7 @@
           <w:lang w:val="nl-NL"/>
         </w:rPr>
         <w:lastRenderedPageBreak/>
-        <w:t xml:space="preserve">op het leven van de </w:t>
-      </w:r>
-      <w:proofErr w:type="spellStart"/>
-      <w:r>
-        <w:rPr>
-          <w:rFonts w:ascii="Courier New" w:hAnsi="Courier New" w:cs="Courier New"/>
-          <w:sz w:val="22"/>
-          <w:szCs w:val="22"/>
-          <w:lang w:val="nl-NL"/>
-        </w:rPr>
-        <w:t>Ossies</w:t>
-      </w:r>
-      <w:proofErr w:type="spellEnd"/>
-      <w:r>
-        <w:rPr>
-          <w:rFonts w:ascii="Courier New" w:hAnsi="Courier New" w:cs="Courier New"/>
-          <w:sz w:val="22"/>
-          <w:szCs w:val="22"/>
-          <w:lang w:val="nl-NL"/>
-        </w:rPr>
-        <w:t xml:space="preserve"> wordt neergekeken. Alles lijkt tegen jou gericht te zijn. </w:t>
-      </w:r>
-      <w:r>
-        <w:rPr>
-          <w:rFonts w:ascii="Courier New" w:hAnsi="Courier New" w:cs="Courier New"/>
-          <w:sz w:val="22"/>
-          <w:szCs w:val="22"/>
-          <w:lang w:val="nl-NL"/>
-        </w:rPr>
-        <w:t xml:space="preserve">Modernisering en rationalisering wordt door de mensen zelf als afbraak ervaren. Het morele kader van ooit is er niet meer en mensen worden ontvankelijk voor de rechts-radicale en </w:t>
+        <w:t xml:space="preserve">morele kader van ooit is er niet meer en mensen worden ontvankelijk voor de rechts-radicale en </w:t>
       </w:r>
       <w:proofErr w:type="spellStart"/>
       <w:r>
@@ -1019,16 +1394,52 @@
           <w:szCs w:val="22"/>
           <w:lang w:val="nl-NL"/>
         </w:rPr>
-        <w:t xml:space="preserve"> bijvoorbeeld, in het zuiden waar een boombacterie miljoenen olijfbomen heeft vernietigd. De olijfboom die een zo centrale plek inneemt in het dagelijkse leven van hun, veranderde dat leven volledig. Daar in die omgevi</w:t>
-      </w:r>
-      <w:r>
-        <w:rPr>
-          <w:rFonts w:ascii="Courier New" w:hAnsi="Courier New" w:cs="Courier New"/>
-          <w:sz w:val="22"/>
-          <w:szCs w:val="22"/>
-          <w:lang w:val="nl-NL"/>
-        </w:rPr>
-        <w:t>ng van verlaten dorpen, ingeslapen stations, nu ook nog in dat landschap met die vele dode olijfbomen en de staat op geen enkele manier aanwezig is, wordt alles wel heel erg leeg.</w:t>
+        <w:t xml:space="preserve"> bijvoorbeeld, in het zuiden waar een boombacterie miljoenen olijfbomen heeft vernietigd. De olijfboom die een zo centrale plek inneemt in het dagelijkse leven van hun, veranderde dat leven volledig. Daar in die </w:t>
+      </w:r>
+      <w:r>
+        <w:rPr>
+          <w:rFonts w:ascii="Courier New" w:hAnsi="Courier New" w:cs="Courier New"/>
+          <w:sz w:val="22"/>
+          <w:szCs w:val="22"/>
+          <w:lang w:val="nl-NL"/>
+        </w:rPr>
+        <w:t xml:space="preserve">zuidelijke </w:t>
+      </w:r>
+      <w:r>
+        <w:rPr>
+          <w:rFonts w:ascii="Courier New" w:hAnsi="Courier New" w:cs="Courier New"/>
+          <w:sz w:val="22"/>
+          <w:szCs w:val="22"/>
+          <w:lang w:val="nl-NL"/>
+        </w:rPr>
+        <w:t>omgevi</w:t>
+      </w:r>
+      <w:r>
+        <w:rPr>
+          <w:rFonts w:ascii="Courier New" w:hAnsi="Courier New" w:cs="Courier New"/>
+          <w:sz w:val="22"/>
+          <w:szCs w:val="22"/>
+          <w:lang w:val="nl-NL"/>
+        </w:rPr>
+        <w:t xml:space="preserve">ng van verlaten dorpen, ingeslapen stations, dode olijfbomen en de staat </w:t>
+      </w:r>
+      <w:r>
+        <w:rPr>
+          <w:rFonts w:ascii="Courier New" w:hAnsi="Courier New" w:cs="Courier New"/>
+          <w:sz w:val="22"/>
+          <w:szCs w:val="22"/>
+          <w:lang w:val="nl-NL"/>
+        </w:rPr>
+        <w:t xml:space="preserve">die nergens </w:t>
+      </w:r>
+      <w:r>
+        <w:rPr>
+          <w:rFonts w:ascii="Courier New" w:hAnsi="Courier New" w:cs="Courier New"/>
+          <w:sz w:val="22"/>
+          <w:szCs w:val="22"/>
+          <w:lang w:val="nl-NL"/>
+        </w:rPr>
+        <w:t>aanwezig is, wordt alles wel heel erg leeg.</w:t>
       </w:r>
       <w:r>
         <w:rPr>
@@ -1050,6 +1461,52 @@
           <w:lang w:val="nl-NL"/>
         </w:rPr>
       </w:pPr>
+      <w:r>
+        <w:rPr>
+          <w:rFonts w:ascii="Courier New" w:hAnsi="Courier New" w:cs="Courier New"/>
+          <w:sz w:val="22"/>
+          <w:szCs w:val="22"/>
+          <w:lang w:val="nl-NL"/>
+        </w:rPr>
+        <w:tab/>
+        <w:t xml:space="preserve">In Frankrijk, waar ze in 2025 tijdelijk werkt ervaart ze hetzelfde waar met de grootschalige decentralisatie de afstand tot de politiek steeds groter wordt en gemeenten zelf met grote schulden blijven zitten. Er komt een tweedeling met rijke </w:t>
+      </w:r>
+      <w:r>
+        <w:rPr>
+          <w:rFonts w:ascii="Courier New" w:hAnsi="Courier New" w:cs="Courier New"/>
+          <w:sz w:val="22"/>
+          <w:szCs w:val="22"/>
+          <w:lang w:val="nl-NL"/>
+        </w:rPr>
+        <w:t xml:space="preserve">en dynamische </w:t>
+      </w:r>
+      <w:r>
+        <w:rPr>
+          <w:rFonts w:ascii="Courier New" w:hAnsi="Courier New" w:cs="Courier New"/>
+          <w:sz w:val="22"/>
+          <w:szCs w:val="22"/>
+          <w:lang w:val="nl-NL"/>
+        </w:rPr>
+        <w:t>stedelijke gebieden met hoogopgeleide burgers</w:t>
+      </w:r>
+      <w:r>
+        <w:rPr>
+          <w:rFonts w:ascii="Courier New" w:hAnsi="Courier New" w:cs="Courier New"/>
+          <w:sz w:val="22"/>
+          <w:szCs w:val="22"/>
+          <w:lang w:val="nl-NL"/>
+        </w:rPr>
+        <w:t xml:space="preserve"> en de kleine steden en dorpen waar scholen, ziekenhuizen en treinverbindingen zijn gesloten.</w:t>
+      </w:r>
+      <w:r>
+        <w:rPr>
+          <w:rFonts w:ascii="Courier New" w:hAnsi="Courier New" w:cs="Courier New"/>
+          <w:sz w:val="22"/>
+          <w:szCs w:val="22"/>
+          <w:lang w:val="nl-NL"/>
+        </w:rPr>
+        <w:t xml:space="preserve"> </w:t>
+      </w:r>
     </w:p>
     <w:p>
       <w:pPr>
@@ -1068,7 +1525,27 @@
           <w:szCs w:val="22"/>
           <w:lang w:val="nl-NL"/>
         </w:rPr>
-        <w:t>Frankrijk</w:t>
+        <w:tab/>
+        <w:t xml:space="preserve">En Nederland zelf is niets beter, met verhalen zoals die over haar vader, het toeslagenschandaal, het Groningse aardbevingsschadeschandaal en andere mensen die worden vermorzeld </w:t>
+      </w:r>
+      <w:r>
+        <w:rPr>
+          <w:rFonts w:ascii="Courier New" w:hAnsi="Courier New" w:cs="Courier New"/>
+          <w:sz w:val="22"/>
+          <w:szCs w:val="22"/>
+          <w:lang w:val="nl-NL"/>
+        </w:rPr>
+        <w:lastRenderedPageBreak/>
+        <w:t>door de overheid. Hier was er een neoliberale wind gaan waaien met een marklogica gericht op concurrentie, efficiëntie en meetbare resultaten. Alles werd technocratische en complexer en een overheid die meer rekent dan luistert</w:t>
+      </w:r>
+      <w:r>
+        <w:rPr>
+          <w:rFonts w:ascii="Courier New" w:hAnsi="Courier New" w:cs="Courier New"/>
+          <w:sz w:val="22"/>
+          <w:szCs w:val="22"/>
+          <w:lang w:val="nl-NL"/>
+        </w:rPr>
+        <w:t>. Ook hier zie je dat de onvrede wordt vertaald in culturele vijandigheid en dat de migrant en de elite daar de schuld van hebben. Het publiek debat dat zich kenmerkt door afnemend vertrouwen en toenemende verontwaardiging en wantrouwen.</w:t>
       </w:r>
     </w:p>
     <w:p>
@@ -1081,15 +1558,6 @@
           <w:lang w:val="nl-NL"/>
         </w:rPr>
       </w:pPr>
-      <w:r>
-        <w:rPr>
-          <w:rFonts w:ascii="Courier New" w:hAnsi="Courier New" w:cs="Courier New"/>
-          <w:sz w:val="22"/>
-          <w:szCs w:val="22"/>
-          <w:lang w:val="nl-NL"/>
-        </w:rPr>
-        <w:t>Nederland</w:t>
-      </w:r>
     </w:p>
     <w:p>
       <w:pPr>
@@ -1112,28 +1580,113 @@
           <w:lang w:val="nl-NL"/>
         </w:rPr>
       </w:pPr>
+      <w:r>
+        <w:rPr>
+          <w:rFonts w:ascii="Courier New" w:hAnsi="Courier New" w:cs="Courier New"/>
+          <w:sz w:val="22"/>
+          <w:szCs w:val="22"/>
+          <w:lang w:val="nl-NL"/>
+        </w:rPr>
+        <w:t>Het politieke verhaal heeft een andere grondtoon nodig en moet weer redelijk, betrouwbaar en menselijk worden. Er moet in ieder geval weer een overheid komen die zich concentreert op wat het doet en weer deel uitmaakt van het dagelijks leven van mensen. Een overheid die zichtbaar wordt, die de menselijke maat hanteert en weer structureel investeert in de publieke infrastructuur. Een andere overheid die nabij en persoonlijk is en dat als structurele voorwaarde ziet.</w:t>
+      </w:r>
+      <w:r>
+        <w:rPr>
+          <w:rFonts w:ascii="Courier New" w:hAnsi="Courier New" w:cs="Courier New"/>
+          <w:sz w:val="22"/>
+          <w:szCs w:val="22"/>
+          <w:lang w:val="nl-NL"/>
+        </w:rPr>
+        <w:t xml:space="preserve"> </w:t>
+      </w:r>
     </w:p>
     <w:p>
       <w:pPr>
         <w:spacing w:line="360" w:lineRule="auto"/>
-        <w:rPr>
-          <w:rFonts w:ascii="Courier New" w:hAnsi="Courier New" w:cs="Courier New"/>
-          <w:sz w:val="22"/>
-          <w:szCs w:val="22"/>
-          <w:lang w:val="nl-NL"/>
-        </w:rPr>
-      </w:pPr>
+        <w:ind w:firstLine="720"/>
+        <w:rPr>
+          <w:rFonts w:ascii="Courier New" w:hAnsi="Courier New" w:cs="Courier New"/>
+          <w:sz w:val="22"/>
+          <w:szCs w:val="22"/>
+          <w:lang w:val="nl-NL"/>
+        </w:rPr>
+      </w:pPr>
+      <w:r>
+        <w:rPr>
+          <w:rFonts w:ascii="Courier New" w:hAnsi="Courier New" w:cs="Courier New"/>
+          <w:sz w:val="22"/>
+          <w:szCs w:val="22"/>
+          <w:lang w:val="nl-NL"/>
+        </w:rPr>
+        <w:t>Meebewegen met rechtse politiek werkt niet. Er moet een alternatieve aanpak komen met een passende logica. Een meerjarige agenda met duidelijke prioriteiten en duidelijk zijn over de keuzes die worden gemaakt. Met een betere uitvoering, snellere loketten en strakkere regie. Die nieuwe politiek vraagt verbeelding die inspireert en richting geeft en dat is een voorwaarde voor democratische vitaliteit.</w:t>
+      </w:r>
+      <w:r>
+        <w:rPr>
+          <w:rFonts w:ascii="Courier New" w:hAnsi="Courier New" w:cs="Courier New"/>
+          <w:sz w:val="22"/>
+          <w:szCs w:val="22"/>
+          <w:lang w:val="nl-NL"/>
+        </w:rPr>
+        <w:t xml:space="preserve"> </w:t>
+      </w:r>
+      <w:r>
+        <w:rPr>
+          <w:rFonts w:ascii="Courier New" w:hAnsi="Courier New" w:cs="Courier New"/>
+          <w:sz w:val="22"/>
+          <w:szCs w:val="22"/>
+          <w:lang w:val="nl-NL"/>
+        </w:rPr>
+        <w:t xml:space="preserve">Den een politiek die de ervaringen van mensen begrijpt en betekenis geeft. Een politiek die moed heeft om de nabijheid terug te brengen en waardigheid en </w:t>
+      </w:r>
+      <w:r>
+        <w:rPr>
+          <w:rFonts w:ascii="Courier New" w:hAnsi="Courier New" w:cs="Courier New"/>
+          <w:sz w:val="22"/>
+          <w:szCs w:val="22"/>
+          <w:lang w:val="nl-NL"/>
+        </w:rPr>
+        <w:t xml:space="preserve">erkenning van burgerschap weet te herstellen. </w:t>
+      </w:r>
     </w:p>
     <w:p>
       <w:pPr>
         <w:spacing w:line="360" w:lineRule="auto"/>
-        <w:rPr>
-          <w:rFonts w:ascii="Courier New" w:hAnsi="Courier New" w:cs="Courier New"/>
-          <w:sz w:val="22"/>
-          <w:szCs w:val="22"/>
-          <w:lang w:val="nl-NL"/>
-        </w:rPr>
-      </w:pPr>
+        <w:ind w:firstLine="720"/>
+        <w:rPr>
+          <w:rFonts w:ascii="Courier New" w:hAnsi="Courier New" w:cs="Courier New"/>
+          <w:sz w:val="22"/>
+          <w:szCs w:val="22"/>
+          <w:lang w:val="nl-NL"/>
+        </w:rPr>
+      </w:pPr>
+      <w:r>
+        <w:rPr>
+          <w:rFonts w:ascii="Courier New" w:hAnsi="Courier New" w:cs="Courier New"/>
+          <w:sz w:val="22"/>
+          <w:szCs w:val="22"/>
+          <w:lang w:val="nl-NL"/>
+        </w:rPr>
+        <w:t xml:space="preserve">Politici weten keuzes te maken, deze uit te leggen en het simpel te houden. Maar dit moet niet alleen het verhaal van politici zijn want ook anderen hebben hun gewoonten aan te passen. Bestuurders bouwen geen ingewikkelde systemen, maar zorgen </w:t>
+      </w:r>
+      <w:proofErr w:type="gramStart"/>
+      <w:r>
+        <w:rPr>
+          <w:rFonts w:ascii="Courier New" w:hAnsi="Courier New" w:cs="Courier New"/>
+          <w:sz w:val="22"/>
+          <w:szCs w:val="22"/>
+          <w:lang w:val="nl-NL"/>
+        </w:rPr>
+        <w:t>er voor</w:t>
+      </w:r>
+      <w:proofErr w:type="gramEnd"/>
+      <w:r>
+        <w:rPr>
+          <w:rFonts w:ascii="Courier New" w:hAnsi="Courier New" w:cs="Courier New"/>
+          <w:sz w:val="22"/>
+          <w:szCs w:val="22"/>
+          <w:lang w:val="nl-NL"/>
+        </w:rPr>
+        <w:t xml:space="preserve"> dat in de uitvoering er meer nabijheid zit. De ambtenaren voeren niet alleen opdrachten uit, maar krijgen meer ruimte en weten die waardig te gebruiken. De media verleggen de aandacht van het conflict naar het werk wat gedaan moet worden. Burgers zelf eisen niet meer grootse beloftes maar meer afgeronde resultaten. En </w:t>
+      </w:r>
       <w:r>
         <w:rPr>
           <w:rFonts w:ascii="Courier New" w:hAnsi="Courier New" w:cs="Courier New"/>
@@ -1142,6 +1695,130 @@
           <w:lang w:val="nl-NL"/>
         </w:rPr>
         <w:lastRenderedPageBreak/>
+        <w:t>iedereen weet dat politiek mensenwerk is en waardigheid en erkenning daar het fundament van is.</w:t>
+      </w:r>
+    </w:p>
+    <w:p>
+      <w:pPr>
+        <w:spacing w:line="360" w:lineRule="auto"/>
+        <w:ind w:firstLine="720"/>
+        <w:rPr>
+          <w:rFonts w:ascii="Courier New" w:hAnsi="Courier New" w:cs="Courier New"/>
+          <w:sz w:val="22"/>
+          <w:szCs w:val="22"/>
+          <w:lang w:val="nl-NL"/>
+        </w:rPr>
+      </w:pPr>
+      <w:r>
+        <w:rPr>
+          <w:rFonts w:ascii="Courier New" w:hAnsi="Courier New" w:cs="Courier New"/>
+          <w:sz w:val="22"/>
+          <w:szCs w:val="22"/>
+          <w:lang w:val="nl-NL"/>
+        </w:rPr>
+        <w:t xml:space="preserve">De Vries heeft aansprekende ideeën over de politiek en bij haar gaat het over de organisatie van het sociale. Zij laat zien dat dit een belangrijk aspect is. Ook uit haar vergelijkende studies tussen gebieden in diverse Europese waar kil wordt bezuinigd op de publieke infrastructuur in vergelijking met gebieden waar minder bezuinigd wordt of minder kil, laat zien dat dit terug te vinden in het stemgedrag van burgers. Daar wordt meer radicaal rechts gestemd. Zij maakt op deze manier als geen ander duidelijk gericht investeren in het welzijn van mensen zo belangrijk is. Haar </w:t>
+      </w:r>
+      <w:proofErr w:type="spellStart"/>
+      <w:r>
+        <w:rPr>
+          <w:rFonts w:ascii="Courier New" w:hAnsi="Courier New" w:cs="Courier New"/>
+          <w:sz w:val="22"/>
+          <w:szCs w:val="22"/>
+          <w:lang w:val="nl-NL"/>
+        </w:rPr>
+        <w:t>ver</w:t>
+      </w:r>
+      <w:r>
+        <w:rPr>
+          <w:rFonts w:ascii="Courier New" w:hAnsi="Courier New" w:cs="Courier New"/>
+          <w:sz w:val="22"/>
+          <w:szCs w:val="22"/>
+          <w:lang w:val="nl-NL"/>
+        </w:rPr>
+        <w:t>xxxx</w:t>
+      </w:r>
+      <w:proofErr w:type="spellEnd"/>
+    </w:p>
+    <w:p>
+      <w:pPr>
+        <w:spacing w:line="360" w:lineRule="auto"/>
+        <w:ind w:firstLine="720"/>
+        <w:rPr>
+          <w:rFonts w:ascii="Courier New" w:hAnsi="Courier New" w:cs="Courier New"/>
+          <w:sz w:val="22"/>
+          <w:szCs w:val="22"/>
+          <w:lang w:val="nl-NL"/>
+        </w:rPr>
+      </w:pPr>
+      <w:r>
+        <w:rPr>
+          <w:rFonts w:ascii="Courier New" w:hAnsi="Courier New" w:cs="Courier New"/>
+          <w:sz w:val="22"/>
+          <w:szCs w:val="22"/>
+          <w:lang w:val="nl-NL"/>
+        </w:rPr>
+        <w:t>Haar nuchtere vader zal zeker trots op haar zijn als hij in het hiernamaals een exemplaar van nieuwe boek te pakken krijgt.</w:t>
+      </w:r>
+      <w:r>
+        <w:rPr>
+          <w:rFonts w:ascii="Courier New" w:hAnsi="Courier New" w:cs="Courier New"/>
+          <w:sz w:val="22"/>
+          <w:szCs w:val="22"/>
+          <w:lang w:val="nl-NL"/>
+        </w:rPr>
+        <w:t xml:space="preserve"> </w:t>
+      </w:r>
+    </w:p>
+    <w:p>
+      <w:pPr>
+        <w:spacing w:line="360" w:lineRule="auto"/>
+        <w:rPr>
+          <w:rFonts w:ascii="Courier New" w:hAnsi="Courier New" w:cs="Courier New"/>
+          <w:sz w:val="22"/>
+          <w:szCs w:val="22"/>
+          <w:lang w:val="nl-NL"/>
+        </w:rPr>
+      </w:pPr>
+    </w:p>
+    <w:p>
+      <w:pPr>
+        <w:spacing w:line="360" w:lineRule="auto"/>
+        <w:rPr>
+          <w:rFonts w:ascii="Courier New" w:hAnsi="Courier New" w:cs="Courier New"/>
+          <w:sz w:val="22"/>
+          <w:szCs w:val="22"/>
+          <w:lang w:val="nl-NL"/>
+        </w:rPr>
+      </w:pPr>
+    </w:p>
+    <w:p>
+      <w:pPr>
+        <w:spacing w:line="360" w:lineRule="auto"/>
+        <w:rPr>
+          <w:rFonts w:ascii="Courier New" w:hAnsi="Courier New" w:cs="Courier New"/>
+          <w:sz w:val="22"/>
+          <w:szCs w:val="22"/>
+          <w:lang w:val="nl-NL"/>
+        </w:rPr>
+      </w:pPr>
+    </w:p>
+    <w:p>
+      <w:pPr>
+        <w:spacing w:line="360" w:lineRule="auto"/>
+        <w:rPr>
+          <w:rFonts w:ascii="Courier New" w:hAnsi="Courier New" w:cs="Courier New"/>
+          <w:sz w:val="22"/>
+          <w:szCs w:val="22"/>
+          <w:lang w:val="nl-NL"/>
+        </w:rPr>
+      </w:pPr>
+      <w:r>
+        <w:rPr>
+          <w:rFonts w:ascii="Courier New" w:hAnsi="Courier New" w:cs="Courier New"/>
+          <w:sz w:val="22"/>
+          <w:szCs w:val="22"/>
+          <w:lang w:val="nl-NL"/>
+        </w:rPr>
         <w:t>Vries</w:t>
       </w:r>
       <w:r>

</xml_diff>

<commit_message>
26-04-27, naar een politiek van nabijheid
</commit_message>
<xml_diff>
--- a/BlogsWord/Politiekvannabijheid.docx
+++ b/BlogsWord/Politiekvannabijheid.docx
@@ -167,7 +167,25 @@
           <w:szCs w:val="22"/>
           <w:lang w:val="nl-NL"/>
         </w:rPr>
-        <w:t xml:space="preserve">n houd ik me aan de regels als ik er toch niets voor terugkrijg?” en “Zakkenvullers, daar in Den Haag”, dat is wat de vader op een gegeven moment over de politiek </w:t>
+        <w:t xml:space="preserve">n houd ik me aan de regels als ik er toch niets voor terugkrijg?” en “Zakkenvullers, daar in Den Haag”, dat is wat de vader </w:t>
+      </w:r>
+      <w:r>
+        <w:rPr>
+          <w:rFonts w:ascii="Courier New" w:hAnsi="Courier New" w:cs="Courier New"/>
+          <w:sz w:val="22"/>
+          <w:szCs w:val="22"/>
+          <w:lang w:val="nl-NL"/>
+        </w:rPr>
+        <w:t xml:space="preserve">van Catherine de Vries </w:t>
+      </w:r>
+      <w:r>
+        <w:rPr>
+          <w:rFonts w:ascii="Courier New" w:hAnsi="Courier New" w:cs="Courier New"/>
+          <w:sz w:val="22"/>
+          <w:szCs w:val="22"/>
+          <w:lang w:val="nl-NL"/>
+        </w:rPr>
+        <w:t xml:space="preserve">op een gegeven moment over de politiek </w:t>
       </w:r>
       <w:r>
         <w:rPr>
@@ -277,26 +295,35 @@
           <w:szCs w:val="22"/>
           <w:lang w:val="nl-NL"/>
         </w:rPr>
+        <w:t xml:space="preserve">daar </w:t>
+      </w:r>
+      <w:r>
+        <w:rPr>
+          <w:rFonts w:ascii="Courier New" w:hAnsi="Courier New" w:cs="Courier New"/>
+          <w:sz w:val="22"/>
+          <w:szCs w:val="22"/>
+          <w:lang w:val="nl-NL"/>
+        </w:rPr>
+        <w:t>geleefd</w:t>
+      </w:r>
+      <w:r>
+        <w:rPr>
+          <w:rFonts w:ascii="Courier New" w:hAnsi="Courier New" w:cs="Courier New"/>
+          <w:sz w:val="22"/>
+          <w:szCs w:val="22"/>
+          <w:lang w:val="nl-NL"/>
+        </w:rPr>
+        <w:t xml:space="preserve"> en zich </w:t>
+      </w:r>
+      <w:r>
+        <w:rPr>
+          <w:rFonts w:ascii="Courier New" w:hAnsi="Courier New" w:cs="Courier New"/>
+          <w:sz w:val="22"/>
+          <w:szCs w:val="22"/>
+          <w:lang w:val="nl-NL"/>
+        </w:rPr>
         <w:t xml:space="preserve">er </w:t>
       </w:r>
-      <w:r>
-        <w:rPr>
-          <w:rFonts w:ascii="Courier New" w:hAnsi="Courier New" w:cs="Courier New"/>
-          <w:sz w:val="22"/>
-          <w:szCs w:val="22"/>
-          <w:lang w:val="nl-NL"/>
-        </w:rPr>
-        <w:t>geleefd</w:t>
-      </w:r>
-      <w:r>
-        <w:rPr>
-          <w:rFonts w:ascii="Courier New" w:hAnsi="Courier New" w:cs="Courier New"/>
-          <w:sz w:val="22"/>
-          <w:szCs w:val="22"/>
-          <w:lang w:val="nl-NL"/>
-        </w:rPr>
-        <w:t xml:space="preserve"> en zich </w:t>
-      </w:r>
       <w:proofErr w:type="spellStart"/>
       <w:r>
         <w:rPr>
@@ -369,7 +396,47 @@
           <w:szCs w:val="22"/>
           <w:lang w:val="nl-NL"/>
         </w:rPr>
-        <w:t xml:space="preserve"> van het CDA via Fortuin naar de partij van Wilders, ook om het CDA een lesje te leren. Hij voelde zich in de steek gelaten en hij was niet de enige, schrijft De Vries in dit prachtige boek. </w:t>
+        <w:t xml:space="preserve"> van het CDA via Fortuin naar de partij van Wilders, ook om het CDA een lesje te leren. Hij was niet de enige, schrijft De Vries in dit prachtige boek</w:t>
+      </w:r>
+      <w:r>
+        <w:rPr>
+          <w:rFonts w:ascii="Courier New" w:hAnsi="Courier New" w:cs="Courier New"/>
+          <w:sz w:val="22"/>
+          <w:szCs w:val="22"/>
+          <w:lang w:val="nl-NL"/>
+        </w:rPr>
+        <w:t xml:space="preserve">: </w:t>
+      </w:r>
+      <w:r>
+        <w:rPr>
+          <w:rFonts w:ascii="Courier New" w:hAnsi="Courier New" w:cs="Courier New"/>
+          <w:i/>
+          <w:iCs/>
+          <w:sz w:val="22"/>
+          <w:szCs w:val="22"/>
+          <w:lang w:val="nl-NL"/>
+        </w:rPr>
+        <w:t>De s</w:t>
+      </w:r>
+      <w:r>
+        <w:rPr>
+          <w:rFonts w:ascii="Courier New" w:hAnsi="Courier New" w:cs="Courier New"/>
+          <w:i/>
+          <w:iCs/>
+          <w:sz w:val="22"/>
+          <w:szCs w:val="22"/>
+          <w:lang w:val="nl-NL"/>
+        </w:rPr>
+        <w:t>ymfonie van onvrede. De opmars van radicaal rechts in Europa</w:t>
+      </w:r>
+      <w:r>
+        <w:rPr>
+          <w:rFonts w:ascii="Courier New" w:hAnsi="Courier New" w:cs="Courier New"/>
+          <w:sz w:val="22"/>
+          <w:szCs w:val="22"/>
+          <w:lang w:val="nl-NL"/>
+        </w:rPr>
+        <w:t xml:space="preserve">. </w:t>
       </w:r>
       <w:r>
         <w:rPr>
@@ -424,6 +491,15 @@
           <w:lang w:val="nl-NL"/>
         </w:rPr>
         <w:t xml:space="preserve">Zijn </w:t>
+      </w:r>
+      <w:r>
+        <w:rPr>
+          <w:rFonts w:ascii="Courier New" w:hAnsi="Courier New" w:cs="Courier New"/>
+          <w:sz w:val="22"/>
+          <w:szCs w:val="22"/>
+          <w:lang w:val="nl-NL"/>
+        </w:rPr>
+        <w:t xml:space="preserve">verhaal </w:t>
       </w:r>
       <w:r>
         <w:rPr>
@@ -534,7 +610,25 @@
           <w:szCs w:val="22"/>
           <w:lang w:val="nl-NL"/>
         </w:rPr>
-        <w:t>Voor de belasting die ze betaalden</w:t>
+        <w:t xml:space="preserve">Voor de belasting die </w:t>
+      </w:r>
+      <w:r>
+        <w:rPr>
+          <w:rFonts w:ascii="Courier New" w:hAnsi="Courier New" w:cs="Courier New"/>
+          <w:sz w:val="22"/>
+          <w:szCs w:val="22"/>
+          <w:lang w:val="nl-NL"/>
+        </w:rPr>
+        <w:t>mensen</w:t>
+      </w:r>
+      <w:r>
+        <w:rPr>
+          <w:rFonts w:ascii="Courier New" w:hAnsi="Courier New" w:cs="Courier New"/>
+          <w:sz w:val="22"/>
+          <w:szCs w:val="22"/>
+          <w:lang w:val="nl-NL"/>
+        </w:rPr>
+        <w:t xml:space="preserve"> betaalden</w:t>
       </w:r>
       <w:r>
         <w:rPr>
@@ -624,7 +718,17 @@
           <w:szCs w:val="22"/>
           <w:lang w:val="nl-NL"/>
         </w:rPr>
-        <w:t xml:space="preserve"> geïnvesteerd in zorg, huisvesting, onderwijs en infrastructuur</w:t>
+        <w:t xml:space="preserve"> </w:t>
+      </w:r>
+      <w:r>
+        <w:rPr>
+          <w:rFonts w:ascii="Courier New" w:hAnsi="Courier New" w:cs="Courier New"/>
+          <w:sz w:val="22"/>
+          <w:szCs w:val="22"/>
+          <w:lang w:val="nl-NL"/>
+        </w:rPr>
+        <w:lastRenderedPageBreak/>
+        <w:t>geïnvesteerd in zorg, huisvesting, onderwijs en infrastructuur</w:t>
       </w:r>
       <w:r>
         <w:rPr>
@@ -642,17 +746,7 @@
           <w:szCs w:val="22"/>
           <w:lang w:val="nl-NL"/>
         </w:rPr>
-        <w:t xml:space="preserve">r </w:t>
-      </w:r>
-      <w:r>
-        <w:rPr>
-          <w:rFonts w:ascii="Courier New" w:hAnsi="Courier New" w:cs="Courier New"/>
-          <w:sz w:val="22"/>
-          <w:szCs w:val="22"/>
-          <w:lang w:val="nl-NL"/>
-        </w:rPr>
-        <w:lastRenderedPageBreak/>
-        <w:t xml:space="preserve">ontstaat materiële en morele ongelijkheid. Bepaalde groepen tellen minder mee en </w:t>
+        <w:t xml:space="preserve">r ontstaat materiële en morele ongelijkheid. Bepaalde groepen tellen minder mee en </w:t>
       </w:r>
       <w:r>
         <w:rPr>
@@ -964,6 +1058,15 @@
           <w:szCs w:val="22"/>
           <w:lang w:val="nl-NL"/>
         </w:rPr>
+        <w:t>.</w:t>
+      </w:r>
+      <w:r>
+        <w:rPr>
+          <w:rFonts w:ascii="Courier New" w:hAnsi="Courier New" w:cs="Courier New"/>
+          <w:sz w:val="22"/>
+          <w:szCs w:val="22"/>
+          <w:lang w:val="nl-NL"/>
+        </w:rPr>
         <w:t xml:space="preserve"> </w:t>
       </w:r>
       <w:r>
@@ -973,43 +1076,16 @@
           <w:szCs w:val="22"/>
           <w:lang w:val="nl-NL"/>
         </w:rPr>
-        <w:t>wordt</w:t>
-      </w:r>
-      <w:r>
-        <w:rPr>
-          <w:rFonts w:ascii="Courier New" w:hAnsi="Courier New" w:cs="Courier New"/>
-          <w:sz w:val="22"/>
-          <w:szCs w:val="22"/>
-          <w:lang w:val="nl-NL"/>
-        </w:rPr>
-        <w:t xml:space="preserve"> </w:t>
-      </w:r>
-      <w:r>
-        <w:rPr>
-          <w:rFonts w:ascii="Courier New" w:hAnsi="Courier New" w:cs="Courier New"/>
-          <w:sz w:val="22"/>
-          <w:szCs w:val="22"/>
-          <w:lang w:val="nl-NL"/>
-        </w:rPr>
-        <w:t>een verhaal van iedereen.</w:t>
-      </w:r>
-      <w:r>
-        <w:rPr>
-          <w:rFonts w:ascii="Courier New" w:hAnsi="Courier New" w:cs="Courier New"/>
-          <w:sz w:val="22"/>
-          <w:szCs w:val="22"/>
-          <w:lang w:val="nl-NL"/>
-        </w:rPr>
-        <w:t xml:space="preserve"> </w:t>
-      </w:r>
-      <w:r>
-        <w:rPr>
-          <w:rFonts w:ascii="Courier New" w:hAnsi="Courier New" w:cs="Courier New"/>
-          <w:sz w:val="22"/>
-          <w:szCs w:val="22"/>
-          <w:lang w:val="nl-NL"/>
-        </w:rPr>
-        <w:t>Dat gaat over</w:t>
+        <w:t>Het wordt het verhaal van iedereen en</w:t>
+      </w:r>
+      <w:r>
+        <w:rPr>
+          <w:rFonts w:ascii="Courier New" w:hAnsi="Courier New" w:cs="Courier New"/>
+          <w:sz w:val="22"/>
+          <w:szCs w:val="22"/>
+          <w:lang w:val="nl-NL"/>
+        </w:rPr>
+        <w:t xml:space="preserve"> gaat over</w:t>
       </w:r>
       <w:r>
         <w:rPr>
@@ -1183,16 +1259,71 @@
           <w:szCs w:val="22"/>
           <w:lang w:val="nl-NL"/>
         </w:rPr>
-        <w:t xml:space="preserve"> sociaal wetenschapper die empirisch onderzoek doet naar deze sociale ontwikkelingen. In Duitsland raakt ze in 1999 betrokken bij een onderzoek naar de sociale en politieke gevolgen van de Duitse eenwording gedurende de afgelopen tien jaar. In de jaren negentig was de nadruk op bezuinigen en budgetdiscipline komen te liggen. Economisch deed het land het goed maar de maatregelen had een hoge sociale prijs waar met name mensen uit het oosten een gevoel van verlies en achterstelling ervaren. Scholen, ziekenhuizen en treinstations worden gesloten </w:t>
-      </w:r>
-      <w:r>
-        <w:rPr>
-          <w:rFonts w:ascii="Courier New" w:hAnsi="Courier New" w:cs="Courier New"/>
-          <w:sz w:val="22"/>
-          <w:szCs w:val="22"/>
-          <w:lang w:val="nl-NL"/>
-        </w:rPr>
-        <w:t xml:space="preserve">in Saksen, Thüringen en Brandenburg </w:t>
+        <w:t xml:space="preserve"> sociaal wetenschapper die empirisch onderzoek doet naar deze sociale ontwikkelingen. In Duitsland raakt ze in 1999 betrokken bij een onderzoek naar de sociale en politieke gevolgen van de Duitse eenwording gedurende de afgelopen tien jaar. In de jaren negentig was </w:t>
+      </w:r>
+      <w:r>
+        <w:rPr>
+          <w:rFonts w:ascii="Courier New" w:hAnsi="Courier New" w:cs="Courier New"/>
+          <w:sz w:val="22"/>
+          <w:szCs w:val="22"/>
+          <w:lang w:val="nl-NL"/>
+        </w:rPr>
+        <w:t xml:space="preserve">daar </w:t>
+      </w:r>
+      <w:r>
+        <w:rPr>
+          <w:rFonts w:ascii="Courier New" w:hAnsi="Courier New" w:cs="Courier New"/>
+          <w:sz w:val="22"/>
+          <w:szCs w:val="22"/>
+          <w:lang w:val="nl-NL"/>
+        </w:rPr>
+        <w:t xml:space="preserve">de nadruk op bezuinigen en budgetdiscipline komen te liggen. Economisch deed het land het goed maar de maatregelen had een hoge sociale prijs waar met name mensen uit het oosten een gevoel van verlies en achterstelling </w:t>
+      </w:r>
+      <w:r>
+        <w:rPr>
+          <w:rFonts w:ascii="Courier New" w:hAnsi="Courier New" w:cs="Courier New"/>
+          <w:sz w:val="22"/>
+          <w:szCs w:val="22"/>
+          <w:lang w:val="nl-NL"/>
+        </w:rPr>
+        <w:t>aan over</w:t>
+      </w:r>
+      <w:r>
+        <w:rPr>
+          <w:rFonts w:ascii="Courier New" w:hAnsi="Courier New" w:cs="Courier New"/>
+          <w:sz w:val="22"/>
+          <w:szCs w:val="22"/>
+          <w:lang w:val="nl-NL"/>
+        </w:rPr>
+        <w:t xml:space="preserve"> hielden</w:t>
+      </w:r>
+      <w:r>
+        <w:rPr>
+          <w:rFonts w:ascii="Courier New" w:hAnsi="Courier New" w:cs="Courier New"/>
+          <w:sz w:val="22"/>
+          <w:szCs w:val="22"/>
+          <w:lang w:val="nl-NL"/>
+        </w:rPr>
+        <w:t xml:space="preserve">. Scholen, ziekenhuizen en treinstations worden gesloten </w:t>
+      </w:r>
+      <w:r>
+        <w:rPr>
+          <w:rFonts w:ascii="Courier New" w:hAnsi="Courier New" w:cs="Courier New"/>
+          <w:sz w:val="22"/>
+          <w:szCs w:val="22"/>
+          <w:lang w:val="nl-NL"/>
+        </w:rPr>
+        <w:t xml:space="preserve">in Saksen, Thüringen </w:t>
+      </w:r>
+      <w:r>
+        <w:rPr>
+          <w:rFonts w:ascii="Courier New" w:hAnsi="Courier New" w:cs="Courier New"/>
+          <w:sz w:val="22"/>
+          <w:szCs w:val="22"/>
+          <w:lang w:val="nl-NL"/>
+        </w:rPr>
+        <w:lastRenderedPageBreak/>
+        <w:t xml:space="preserve">en Brandenburg </w:t>
       </w:r>
       <w:r>
         <w:rPr>
@@ -1248,17 +1379,7 @@
           <w:szCs w:val="22"/>
           <w:lang w:val="nl-NL"/>
         </w:rPr>
-        <w:t xml:space="preserve">Modernisering en rationalisering wordt door de mensen zelf als afbraak ervaren. Het </w:t>
-      </w:r>
-      <w:r>
-        <w:rPr>
-          <w:rFonts w:ascii="Courier New" w:hAnsi="Courier New" w:cs="Courier New"/>
-          <w:sz w:val="22"/>
-          <w:szCs w:val="22"/>
-          <w:lang w:val="nl-NL"/>
-        </w:rPr>
-        <w:lastRenderedPageBreak/>
-        <w:t xml:space="preserve">morele kader van ooit is er niet meer en mensen worden ontvankelijk voor de rechts-radicale en </w:t>
+        <w:t xml:space="preserve">Modernisering en rationalisering wordt door de mensen zelf als afbraak ervaren. Het morele kader van ooit is er niet meer en mensen worden ontvankelijk voor de rechts-radicale en </w:t>
       </w:r>
       <w:proofErr w:type="spellStart"/>
       <w:r>
@@ -1278,7 +1399,25 @@
           <w:szCs w:val="22"/>
           <w:lang w:val="nl-NL"/>
         </w:rPr>
-        <w:t xml:space="preserve"> verhalen die het verlies betekenis geven. Zij voelen heel goed aan dat dat dat verlies meer existentieel dan economisch is. </w:t>
+        <w:t xml:space="preserve"> verhalen die het verlies betekenis </w:t>
+      </w:r>
+      <w:r>
+        <w:rPr>
+          <w:rFonts w:ascii="Courier New" w:hAnsi="Courier New" w:cs="Courier New"/>
+          <w:sz w:val="22"/>
+          <w:szCs w:val="22"/>
+          <w:lang w:val="nl-NL"/>
+        </w:rPr>
+        <w:t xml:space="preserve">weten te </w:t>
+      </w:r>
+      <w:r>
+        <w:rPr>
+          <w:rFonts w:ascii="Courier New" w:hAnsi="Courier New" w:cs="Courier New"/>
+          <w:sz w:val="22"/>
+          <w:szCs w:val="22"/>
+          <w:lang w:val="nl-NL"/>
+        </w:rPr>
+        <w:t xml:space="preserve">geven. Zij voelen heel goed aan dat dat dat verlies meer existentieel dan economisch is. </w:t>
       </w:r>
     </w:p>
     <w:p>
@@ -1374,7 +1513,25 @@
           <w:lang w:val="nl-NL"/>
         </w:rPr>
         <w:tab/>
-        <w:t xml:space="preserve">In Engeland was het haar behoorlijk benauwend geworden en ze vertrekt via Nederland naar Milaan (Italië). In Milaan en andere delen van Noord-Italië leef je nog wel in een roes van vooruitgang, maar in andere delen groeide wel degelijk dat gevoel van stilstand dat haar zo bekend voorkomt. In </w:t>
+        <w:t xml:space="preserve">In Engeland was het haar behoorlijk benauwend geworden en ze vertrekt via Nederland naar Milaan (Italië). In Milaan en andere delen van Noord-Italië leef je nog wel in een roes van vooruitgang, maar in andere delen </w:t>
+      </w:r>
+      <w:r>
+        <w:rPr>
+          <w:rFonts w:ascii="Courier New" w:hAnsi="Courier New" w:cs="Courier New"/>
+          <w:sz w:val="22"/>
+          <w:szCs w:val="22"/>
+          <w:lang w:val="nl-NL"/>
+        </w:rPr>
+        <w:t xml:space="preserve">van dat land </w:t>
+      </w:r>
+      <w:r>
+        <w:rPr>
+          <w:rFonts w:ascii="Courier New" w:hAnsi="Courier New" w:cs="Courier New"/>
+          <w:sz w:val="22"/>
+          <w:szCs w:val="22"/>
+          <w:lang w:val="nl-NL"/>
+        </w:rPr>
+        <w:t xml:space="preserve">groeide wel degelijk dat gevoel van stilstand dat haar zo bekend voorkomt. In </w:t>
       </w:r>
       <w:proofErr w:type="spellStart"/>
       <w:r>
@@ -1394,7 +1551,25 @@
           <w:szCs w:val="22"/>
           <w:lang w:val="nl-NL"/>
         </w:rPr>
-        <w:t xml:space="preserve"> bijvoorbeeld, in het zuiden waar een boombacterie miljoenen olijfbomen heeft vernietigd. De olijfboom die een zo centrale plek inneemt in het dagelijkse leven van hun, veranderde dat leven volledig. Daar in die </w:t>
+        <w:t xml:space="preserve"> bijvoorbeeld, in het zuiden waar een boombacterie miljoenen olijfbomen heeft vernietigd. De olijfboom die een zo centrale plek inneemt in het dagelijkse leven </w:t>
+      </w:r>
+      <w:r>
+        <w:rPr>
+          <w:rFonts w:ascii="Courier New" w:hAnsi="Courier New" w:cs="Courier New"/>
+          <w:sz w:val="22"/>
+          <w:szCs w:val="22"/>
+          <w:lang w:val="nl-NL"/>
+        </w:rPr>
+        <w:t>hier</w:t>
+      </w:r>
+      <w:r>
+        <w:rPr>
+          <w:rFonts w:ascii="Courier New" w:hAnsi="Courier New" w:cs="Courier New"/>
+          <w:sz w:val="22"/>
+          <w:szCs w:val="22"/>
+          <w:lang w:val="nl-NL"/>
+        </w:rPr>
+        <w:t xml:space="preserve">, veranderde dat leven volledig. Daar in die </w:t>
       </w:r>
       <w:r>
         <w:rPr>
@@ -1525,27 +1700,155 @@
           <w:szCs w:val="22"/>
           <w:lang w:val="nl-NL"/>
         </w:rPr>
+        <w:lastRenderedPageBreak/>
         <w:tab/>
-        <w:t xml:space="preserve">En Nederland zelf is niets beter, met verhalen zoals die over haar vader, het toeslagenschandaal, het Groningse aardbevingsschadeschandaal en andere mensen die worden vermorzeld </w:t>
-      </w:r>
-      <w:r>
-        <w:rPr>
-          <w:rFonts w:ascii="Courier New" w:hAnsi="Courier New" w:cs="Courier New"/>
-          <w:sz w:val="22"/>
-          <w:szCs w:val="22"/>
-          <w:lang w:val="nl-NL"/>
-        </w:rPr>
-        <w:lastRenderedPageBreak/>
-        <w:t>door de overheid. Hier was er een neoliberale wind gaan waaien met een marklogica gericht op concurrentie, efficiëntie en meetbare resultaten. Alles werd technocratische en complexer en een overheid die meer rekent dan luistert</w:t>
-      </w:r>
-      <w:r>
-        <w:rPr>
-          <w:rFonts w:ascii="Courier New" w:hAnsi="Courier New" w:cs="Courier New"/>
-          <w:sz w:val="22"/>
-          <w:szCs w:val="22"/>
-          <w:lang w:val="nl-NL"/>
-        </w:rPr>
-        <w:t>. Ook hier zie je dat de onvrede wordt vertaald in culturele vijandigheid en dat de migrant en de elite daar de schuld van hebben. Het publiek debat dat zich kenmerkt door afnemend vertrouwen en toenemende verontwaardiging en wantrouwen.</w:t>
+        <w:t xml:space="preserve">En Nederland zelf is niets beter, met verhalen zoals die over haar vader, het toeslagenschandaal, het Groningse aardbevingsschadeschandaal en andere mensen die worden vermorzeld door de overheid. Hier </w:t>
+      </w:r>
+      <w:r>
+        <w:rPr>
+          <w:rFonts w:ascii="Courier New" w:hAnsi="Courier New" w:cs="Courier New"/>
+          <w:sz w:val="22"/>
+          <w:szCs w:val="22"/>
+          <w:lang w:val="nl-NL"/>
+        </w:rPr>
+        <w:t>is</w:t>
+      </w:r>
+      <w:r>
+        <w:rPr>
+          <w:rFonts w:ascii="Courier New" w:hAnsi="Courier New" w:cs="Courier New"/>
+          <w:sz w:val="22"/>
+          <w:szCs w:val="22"/>
+          <w:lang w:val="nl-NL"/>
+        </w:rPr>
+        <w:t xml:space="preserve"> er een neoliberale wind gaan waaien met een marklogica gericht op concurrentie, efficiëntie en meetbare resultaten. Alles w</w:t>
+      </w:r>
+      <w:r>
+        <w:rPr>
+          <w:rFonts w:ascii="Courier New" w:hAnsi="Courier New" w:cs="Courier New"/>
+          <w:sz w:val="22"/>
+          <w:szCs w:val="22"/>
+          <w:lang w:val="nl-NL"/>
+        </w:rPr>
+        <w:t>ordt</w:t>
+      </w:r>
+      <w:r>
+        <w:rPr>
+          <w:rFonts w:ascii="Courier New" w:hAnsi="Courier New" w:cs="Courier New"/>
+          <w:sz w:val="22"/>
+          <w:szCs w:val="22"/>
+          <w:lang w:val="nl-NL"/>
+        </w:rPr>
+        <w:t xml:space="preserve"> </w:t>
+      </w:r>
+      <w:proofErr w:type="spellStart"/>
+      <w:r>
+        <w:rPr>
+          <w:rFonts w:ascii="Courier New" w:hAnsi="Courier New" w:cs="Courier New"/>
+          <w:sz w:val="22"/>
+          <w:szCs w:val="22"/>
+          <w:lang w:val="nl-NL"/>
+        </w:rPr>
+        <w:t>technocratis</w:t>
+      </w:r>
+      <w:r>
+        <w:rPr>
+          <w:rFonts w:ascii="Courier New" w:hAnsi="Courier New" w:cs="Courier New"/>
+          <w:sz w:val="22"/>
+          <w:szCs w:val="22"/>
+          <w:lang w:val="nl-NL"/>
+        </w:rPr>
+        <w:t>ch</w:t>
+      </w:r>
+      <w:r>
+        <w:rPr>
+          <w:rFonts w:ascii="Courier New" w:hAnsi="Courier New" w:cs="Courier New"/>
+          <w:sz w:val="22"/>
+          <w:szCs w:val="22"/>
+          <w:lang w:val="nl-NL"/>
+        </w:rPr>
+        <w:t>e</w:t>
+      </w:r>
+      <w:r>
+        <w:rPr>
+          <w:rFonts w:ascii="Courier New" w:hAnsi="Courier New" w:cs="Courier New"/>
+          <w:sz w:val="22"/>
+          <w:szCs w:val="22"/>
+          <w:lang w:val="nl-NL"/>
+        </w:rPr>
+        <w:t>r</w:t>
+      </w:r>
+      <w:proofErr w:type="spellEnd"/>
+      <w:r>
+        <w:rPr>
+          <w:rFonts w:ascii="Courier New" w:hAnsi="Courier New" w:cs="Courier New"/>
+          <w:sz w:val="22"/>
+          <w:szCs w:val="22"/>
+          <w:lang w:val="nl-NL"/>
+        </w:rPr>
+        <w:t xml:space="preserve"> en complexer en </w:t>
+      </w:r>
+      <w:r>
+        <w:rPr>
+          <w:rFonts w:ascii="Courier New" w:hAnsi="Courier New" w:cs="Courier New"/>
+          <w:sz w:val="22"/>
+          <w:szCs w:val="22"/>
+          <w:lang w:val="nl-NL"/>
+        </w:rPr>
+        <w:t xml:space="preserve">er is </w:t>
+      </w:r>
+      <w:r>
+        <w:rPr>
+          <w:rFonts w:ascii="Courier New" w:hAnsi="Courier New" w:cs="Courier New"/>
+          <w:sz w:val="22"/>
+          <w:szCs w:val="22"/>
+          <w:lang w:val="nl-NL"/>
+        </w:rPr>
+        <w:t>een overheid die meer rekent dan luistert</w:t>
+      </w:r>
+      <w:r>
+        <w:rPr>
+          <w:rFonts w:ascii="Courier New" w:hAnsi="Courier New" w:cs="Courier New"/>
+          <w:sz w:val="22"/>
+          <w:szCs w:val="22"/>
+          <w:lang w:val="nl-NL"/>
+        </w:rPr>
+        <w:t xml:space="preserve">. Ook hier zie je dat de onvrede wordt vertaald in culturele vijandigheid en dat de migrant en de elite daar de schuld van </w:t>
+      </w:r>
+      <w:r>
+        <w:rPr>
+          <w:rFonts w:ascii="Courier New" w:hAnsi="Courier New" w:cs="Courier New"/>
+          <w:sz w:val="22"/>
+          <w:szCs w:val="22"/>
+          <w:lang w:val="nl-NL"/>
+        </w:rPr>
+        <w:t>krijgen, met</w:t>
+      </w:r>
+      <w:r>
+        <w:rPr>
+          <w:rFonts w:ascii="Courier New" w:hAnsi="Courier New" w:cs="Courier New"/>
+          <w:sz w:val="22"/>
+          <w:szCs w:val="22"/>
+          <w:lang w:val="nl-NL"/>
+        </w:rPr>
+        <w:t xml:space="preserve"> </w:t>
+      </w:r>
+      <w:r>
+        <w:rPr>
+          <w:rFonts w:ascii="Courier New" w:hAnsi="Courier New" w:cs="Courier New"/>
+          <w:sz w:val="22"/>
+          <w:szCs w:val="22"/>
+          <w:lang w:val="nl-NL"/>
+        </w:rPr>
+        <w:t>een</w:t>
+      </w:r>
+      <w:r>
+        <w:rPr>
+          <w:rFonts w:ascii="Courier New" w:hAnsi="Courier New" w:cs="Courier New"/>
+          <w:sz w:val="22"/>
+          <w:szCs w:val="22"/>
+          <w:lang w:val="nl-NL"/>
+        </w:rPr>
+        <w:t xml:space="preserve"> publiek debat dat zich kenmerkt door afnemend vertrouwen en toenemende verontwaardiging en wantrouwen.</w:t>
       </w:r>
     </w:p>
     <w:p>
@@ -1587,7 +1890,187 @@
           <w:szCs w:val="22"/>
           <w:lang w:val="nl-NL"/>
         </w:rPr>
-        <w:t>Het politieke verhaal heeft een andere grondtoon nodig en moet weer redelijk, betrouwbaar en menselijk worden. Er moet in ieder geval weer een overheid komen die zich concentreert op wat het doet en weer deel uitmaakt van het dagelijks leven van mensen. Een overheid die zichtbaar wordt, die de menselijke maat hanteert en weer structureel investeert in de publieke infrastructuur. Een andere overheid die nabij en persoonlijk is en dat als structurele voorwaarde ziet.</w:t>
+        <w:t xml:space="preserve">Het politieke verhaal heeft een andere grondtoon nodig en moet weer redelijk, betrouwbaar en menselijk worden. </w:t>
+      </w:r>
+      <w:r>
+        <w:rPr>
+          <w:rFonts w:ascii="Courier New" w:hAnsi="Courier New" w:cs="Courier New"/>
+          <w:sz w:val="22"/>
+          <w:szCs w:val="22"/>
+          <w:lang w:val="nl-NL"/>
+        </w:rPr>
+        <w:t xml:space="preserve">Daar is De Vries van overtuigd. In ieder geval is er </w:t>
+      </w:r>
+      <w:r>
+        <w:rPr>
+          <w:rFonts w:ascii="Courier New" w:hAnsi="Courier New" w:cs="Courier New"/>
+          <w:sz w:val="22"/>
+          <w:szCs w:val="22"/>
+          <w:lang w:val="nl-NL"/>
+        </w:rPr>
+        <w:t xml:space="preserve">een overheid </w:t>
+      </w:r>
+      <w:r>
+        <w:rPr>
+          <w:rFonts w:ascii="Courier New" w:hAnsi="Courier New" w:cs="Courier New"/>
+          <w:sz w:val="22"/>
+          <w:szCs w:val="22"/>
+          <w:lang w:val="nl-NL"/>
+        </w:rPr>
+        <w:t>nodig</w:t>
+      </w:r>
+      <w:r>
+        <w:rPr>
+          <w:rFonts w:ascii="Courier New" w:hAnsi="Courier New" w:cs="Courier New"/>
+          <w:sz w:val="22"/>
+          <w:szCs w:val="22"/>
+          <w:lang w:val="nl-NL"/>
+        </w:rPr>
+        <w:t xml:space="preserve"> die zich concentreert op wat het doet en weer deel </w:t>
+      </w:r>
+      <w:r>
+        <w:rPr>
+          <w:rFonts w:ascii="Courier New" w:hAnsi="Courier New" w:cs="Courier New"/>
+          <w:sz w:val="22"/>
+          <w:szCs w:val="22"/>
+          <w:lang w:val="nl-NL"/>
+        </w:rPr>
+        <w:t xml:space="preserve">gaat </w:t>
+      </w:r>
+      <w:r>
+        <w:rPr>
+          <w:rFonts w:ascii="Courier New" w:hAnsi="Courier New" w:cs="Courier New"/>
+          <w:sz w:val="22"/>
+          <w:szCs w:val="22"/>
+          <w:lang w:val="nl-NL"/>
+        </w:rPr>
+        <w:t>uitma</w:t>
+      </w:r>
+      <w:r>
+        <w:rPr>
+          <w:rFonts w:ascii="Courier New" w:hAnsi="Courier New" w:cs="Courier New"/>
+          <w:sz w:val="22"/>
+          <w:szCs w:val="22"/>
+          <w:lang w:val="nl-NL"/>
+        </w:rPr>
+        <w:t>ken</w:t>
+      </w:r>
+      <w:r>
+        <w:rPr>
+          <w:rFonts w:ascii="Courier New" w:hAnsi="Courier New" w:cs="Courier New"/>
+          <w:sz w:val="22"/>
+          <w:szCs w:val="22"/>
+          <w:lang w:val="nl-NL"/>
+        </w:rPr>
+        <w:t xml:space="preserve"> van het dagelijks leven van mensen. Een overheid die zichtbaar </w:t>
+      </w:r>
+      <w:r>
+        <w:rPr>
+          <w:rFonts w:ascii="Courier New" w:hAnsi="Courier New" w:cs="Courier New"/>
+          <w:sz w:val="22"/>
+          <w:szCs w:val="22"/>
+          <w:lang w:val="nl-NL"/>
+        </w:rPr>
+        <w:t>is</w:t>
+      </w:r>
+      <w:r>
+        <w:rPr>
+          <w:rFonts w:ascii="Courier New" w:hAnsi="Courier New" w:cs="Courier New"/>
+          <w:sz w:val="22"/>
+          <w:szCs w:val="22"/>
+          <w:lang w:val="nl-NL"/>
+        </w:rPr>
+        <w:t>, die de menselijke maat hanteert en weer structureel investeert in de publieke infrastructuur. Een andere overheid die nabij en persoonlijk is en dat als structurele voorwaarde ziet.</w:t>
+      </w:r>
+      <w:r>
+        <w:rPr>
+          <w:rFonts w:ascii="Courier New" w:hAnsi="Courier New" w:cs="Courier New"/>
+          <w:sz w:val="22"/>
+          <w:szCs w:val="22"/>
+          <w:lang w:val="nl-NL"/>
+        </w:rPr>
+        <w:t xml:space="preserve"> Meebewegen met rechtse politiek</w:t>
+      </w:r>
+      <w:r>
+        <w:rPr>
+          <w:rFonts w:ascii="Courier New" w:hAnsi="Courier New" w:cs="Courier New"/>
+          <w:sz w:val="22"/>
+          <w:szCs w:val="22"/>
+          <w:lang w:val="nl-NL"/>
+        </w:rPr>
+        <w:t>, zoals te lang is gebeurd,</w:t>
+      </w:r>
+      <w:r>
+        <w:rPr>
+          <w:rFonts w:ascii="Courier New" w:hAnsi="Courier New" w:cs="Courier New"/>
+          <w:sz w:val="22"/>
+          <w:szCs w:val="22"/>
+          <w:lang w:val="nl-NL"/>
+        </w:rPr>
+        <w:t xml:space="preserve"> werkt niet. Er </w:t>
+      </w:r>
+      <w:r>
+        <w:rPr>
+          <w:rFonts w:ascii="Courier New" w:hAnsi="Courier New" w:cs="Courier New"/>
+          <w:sz w:val="22"/>
+          <w:szCs w:val="22"/>
+          <w:lang w:val="nl-NL"/>
+        </w:rPr>
+        <w:t>is</w:t>
+      </w:r>
+      <w:r>
+        <w:rPr>
+          <w:rFonts w:ascii="Courier New" w:hAnsi="Courier New" w:cs="Courier New"/>
+          <w:sz w:val="22"/>
+          <w:szCs w:val="22"/>
+          <w:lang w:val="nl-NL"/>
+        </w:rPr>
+        <w:t xml:space="preserve"> een alternatieve aanpak </w:t>
+      </w:r>
+      <w:r>
+        <w:rPr>
+          <w:rFonts w:ascii="Courier New" w:hAnsi="Courier New" w:cs="Courier New"/>
+          <w:sz w:val="22"/>
+          <w:szCs w:val="22"/>
+          <w:lang w:val="nl-NL"/>
+        </w:rPr>
+        <w:t>nodig</w:t>
+      </w:r>
+      <w:r>
+        <w:rPr>
+          <w:rFonts w:ascii="Courier New" w:hAnsi="Courier New" w:cs="Courier New"/>
+          <w:sz w:val="22"/>
+          <w:szCs w:val="22"/>
+          <w:lang w:val="nl-NL"/>
+        </w:rPr>
+        <w:t xml:space="preserve"> met een passende logica. Een meerjarige agenda </w:t>
+      </w:r>
+      <w:r>
+        <w:rPr>
+          <w:rFonts w:ascii="Courier New" w:hAnsi="Courier New" w:cs="Courier New"/>
+          <w:sz w:val="22"/>
+          <w:szCs w:val="22"/>
+          <w:lang w:val="nl-NL"/>
+        </w:rPr>
+        <w:t xml:space="preserve">ook </w:t>
+      </w:r>
+      <w:r>
+        <w:rPr>
+          <w:rFonts w:ascii="Courier New" w:hAnsi="Courier New" w:cs="Courier New"/>
+          <w:sz w:val="22"/>
+          <w:szCs w:val="22"/>
+          <w:lang w:val="nl-NL"/>
+        </w:rPr>
+        <w:t>met duidelijke prioriteiten</w:t>
+      </w:r>
+      <w:r>
+        <w:rPr>
+          <w:rFonts w:ascii="Courier New" w:hAnsi="Courier New" w:cs="Courier New"/>
+          <w:sz w:val="22"/>
+          <w:szCs w:val="22"/>
+          <w:lang w:val="nl-NL"/>
+        </w:rPr>
+        <w:t>, met mensen die duidelijk kunnen maken waarom</w:t>
       </w:r>
       <w:r>
         <w:rPr>
@@ -1597,6 +2080,249 @@
           <w:lang w:val="nl-NL"/>
         </w:rPr>
         <w:t xml:space="preserve"> </w:t>
+      </w:r>
+      <w:r>
+        <w:rPr>
+          <w:rFonts w:ascii="Courier New" w:hAnsi="Courier New" w:cs="Courier New"/>
+          <w:sz w:val="22"/>
+          <w:szCs w:val="22"/>
+          <w:lang w:val="nl-NL"/>
+        </w:rPr>
+        <w:t>bepaalde</w:t>
+      </w:r>
+      <w:r>
+        <w:rPr>
+          <w:rFonts w:ascii="Courier New" w:hAnsi="Courier New" w:cs="Courier New"/>
+          <w:sz w:val="22"/>
+          <w:szCs w:val="22"/>
+          <w:lang w:val="nl-NL"/>
+        </w:rPr>
+        <w:t xml:space="preserve"> keuzes worden gemaakt. Met een betere uitvoering</w:t>
+      </w:r>
+      <w:r>
+        <w:rPr>
+          <w:rFonts w:ascii="Courier New" w:hAnsi="Courier New" w:cs="Courier New"/>
+          <w:sz w:val="22"/>
+          <w:szCs w:val="22"/>
+          <w:lang w:val="nl-NL"/>
+        </w:rPr>
+        <w:t xml:space="preserve"> ook</w:t>
+      </w:r>
+      <w:r>
+        <w:rPr>
+          <w:rFonts w:ascii="Courier New" w:hAnsi="Courier New" w:cs="Courier New"/>
+          <w:sz w:val="22"/>
+          <w:szCs w:val="22"/>
+          <w:lang w:val="nl-NL"/>
+        </w:rPr>
+        <w:t>, snellere loketten en strakkere regie. D</w:t>
+      </w:r>
+      <w:r>
+        <w:rPr>
+          <w:rFonts w:ascii="Courier New" w:hAnsi="Courier New" w:cs="Courier New"/>
+          <w:sz w:val="22"/>
+          <w:szCs w:val="22"/>
+          <w:lang w:val="nl-NL"/>
+        </w:rPr>
+        <w:t>eze</w:t>
+      </w:r>
+      <w:r>
+        <w:rPr>
+          <w:rFonts w:ascii="Courier New" w:hAnsi="Courier New" w:cs="Courier New"/>
+          <w:sz w:val="22"/>
+          <w:szCs w:val="22"/>
+          <w:lang w:val="nl-NL"/>
+        </w:rPr>
+        <w:t xml:space="preserve"> nieuwe politiek vraagt verbeelding</w:t>
+      </w:r>
+      <w:r>
+        <w:rPr>
+          <w:rFonts w:ascii="Courier New" w:hAnsi="Courier New" w:cs="Courier New"/>
+          <w:sz w:val="22"/>
+          <w:szCs w:val="22"/>
+          <w:lang w:val="nl-NL"/>
+        </w:rPr>
+        <w:t>, een vermogen om je een andere toekomst voor te stellen,</w:t>
+      </w:r>
+      <w:r>
+        <w:rPr>
+          <w:rFonts w:ascii="Courier New" w:hAnsi="Courier New" w:cs="Courier New"/>
+          <w:sz w:val="22"/>
+          <w:szCs w:val="22"/>
+          <w:lang w:val="nl-NL"/>
+        </w:rPr>
+        <w:t xml:space="preserve"> die inspireert en richting geef</w:t>
+      </w:r>
+      <w:r>
+        <w:rPr>
+          <w:rFonts w:ascii="Courier New" w:hAnsi="Courier New" w:cs="Courier New"/>
+          <w:sz w:val="22"/>
+          <w:szCs w:val="22"/>
+          <w:lang w:val="nl-NL"/>
+        </w:rPr>
+        <w:t>t. Dat is in ieder geval</w:t>
+      </w:r>
+      <w:r>
+        <w:rPr>
+          <w:rFonts w:ascii="Courier New" w:hAnsi="Courier New" w:cs="Courier New"/>
+          <w:sz w:val="22"/>
+          <w:szCs w:val="22"/>
+          <w:lang w:val="nl-NL"/>
+        </w:rPr>
+        <w:t xml:space="preserve"> een voorwaarde voor democratische vitaliteit.</w:t>
+      </w:r>
+      <w:r>
+        <w:rPr>
+          <w:rFonts w:ascii="Courier New" w:hAnsi="Courier New" w:cs="Courier New"/>
+          <w:sz w:val="22"/>
+          <w:szCs w:val="22"/>
+          <w:lang w:val="nl-NL"/>
+        </w:rPr>
+        <w:t xml:space="preserve"> </w:t>
+      </w:r>
+      <w:r>
+        <w:rPr>
+          <w:rFonts w:ascii="Courier New" w:hAnsi="Courier New" w:cs="Courier New"/>
+          <w:sz w:val="22"/>
+          <w:szCs w:val="22"/>
+          <w:lang w:val="nl-NL"/>
+        </w:rPr>
+        <w:t>D</w:t>
+      </w:r>
+      <w:r>
+        <w:rPr>
+          <w:rFonts w:ascii="Courier New" w:hAnsi="Courier New" w:cs="Courier New"/>
+          <w:sz w:val="22"/>
+          <w:szCs w:val="22"/>
+          <w:lang w:val="nl-NL"/>
+        </w:rPr>
+        <w:t>ie nieuwe</w:t>
+      </w:r>
+      <w:r>
+        <w:rPr>
+          <w:rFonts w:ascii="Courier New" w:hAnsi="Courier New" w:cs="Courier New"/>
+          <w:sz w:val="22"/>
+          <w:szCs w:val="22"/>
+          <w:lang w:val="nl-NL"/>
+        </w:rPr>
+        <w:t xml:space="preserve"> politiek</w:t>
+      </w:r>
+      <w:r>
+        <w:rPr>
+          <w:rFonts w:ascii="Courier New" w:hAnsi="Courier New" w:cs="Courier New"/>
+          <w:sz w:val="22"/>
+          <w:szCs w:val="22"/>
+          <w:lang w:val="nl-NL"/>
+        </w:rPr>
+        <w:t xml:space="preserve"> begrijpt </w:t>
+      </w:r>
+      <w:r>
+        <w:rPr>
+          <w:rFonts w:ascii="Courier New" w:hAnsi="Courier New" w:cs="Courier New"/>
+          <w:sz w:val="22"/>
+          <w:szCs w:val="22"/>
+          <w:lang w:val="nl-NL"/>
+        </w:rPr>
+        <w:t xml:space="preserve">de ervaringen van mensen en </w:t>
+      </w:r>
+      <w:r>
+        <w:rPr>
+          <w:rFonts w:ascii="Courier New" w:hAnsi="Courier New" w:cs="Courier New"/>
+          <w:sz w:val="22"/>
+          <w:szCs w:val="22"/>
+          <w:lang w:val="nl-NL"/>
+        </w:rPr>
+        <w:t xml:space="preserve">geeft er </w:t>
+      </w:r>
+      <w:r>
+        <w:rPr>
+          <w:rFonts w:ascii="Courier New" w:hAnsi="Courier New" w:cs="Courier New"/>
+          <w:sz w:val="22"/>
+          <w:szCs w:val="22"/>
+          <w:lang w:val="nl-NL"/>
+        </w:rPr>
+        <w:t xml:space="preserve">betekenis </w:t>
+      </w:r>
+      <w:r>
+        <w:rPr>
+          <w:rFonts w:ascii="Courier New" w:hAnsi="Courier New" w:cs="Courier New"/>
+          <w:sz w:val="22"/>
+          <w:szCs w:val="22"/>
+          <w:lang w:val="nl-NL"/>
+        </w:rPr>
+        <w:t>aan</w:t>
+      </w:r>
+      <w:r>
+        <w:rPr>
+          <w:rFonts w:ascii="Courier New" w:hAnsi="Courier New" w:cs="Courier New"/>
+          <w:sz w:val="22"/>
+          <w:szCs w:val="22"/>
+          <w:lang w:val="nl-NL"/>
+        </w:rPr>
+        <w:t xml:space="preserve">. </w:t>
+      </w:r>
+      <w:r>
+        <w:rPr>
+          <w:rFonts w:ascii="Courier New" w:hAnsi="Courier New" w:cs="Courier New"/>
+          <w:sz w:val="22"/>
+          <w:szCs w:val="22"/>
+          <w:lang w:val="nl-NL"/>
+        </w:rPr>
+        <w:t>In ieder geval heeft ze</w:t>
+      </w:r>
+      <w:r>
+        <w:rPr>
+          <w:rFonts w:ascii="Courier New" w:hAnsi="Courier New" w:cs="Courier New"/>
+          <w:sz w:val="22"/>
+          <w:szCs w:val="22"/>
+          <w:lang w:val="nl-NL"/>
+        </w:rPr>
+        <w:t xml:space="preserve"> d</w:t>
+      </w:r>
+      <w:r>
+        <w:rPr>
+          <w:rFonts w:ascii="Courier New" w:hAnsi="Courier New" w:cs="Courier New"/>
+          <w:sz w:val="22"/>
+          <w:szCs w:val="22"/>
+          <w:lang w:val="nl-NL"/>
+        </w:rPr>
+        <w:t>e</w:t>
+      </w:r>
+      <w:r>
+        <w:rPr>
+          <w:rFonts w:ascii="Courier New" w:hAnsi="Courier New" w:cs="Courier New"/>
+          <w:sz w:val="22"/>
+          <w:szCs w:val="22"/>
+          <w:lang w:val="nl-NL"/>
+        </w:rPr>
+        <w:t xml:space="preserve"> moed om de nabijheid terug te brengen en </w:t>
+      </w:r>
+      <w:r>
+        <w:rPr>
+          <w:rFonts w:ascii="Courier New" w:hAnsi="Courier New" w:cs="Courier New"/>
+          <w:sz w:val="22"/>
+          <w:szCs w:val="22"/>
+          <w:lang w:val="nl-NL"/>
+        </w:rPr>
+        <w:t xml:space="preserve">ze weet </w:t>
+      </w:r>
+      <w:r>
+        <w:rPr>
+          <w:rFonts w:ascii="Courier New" w:hAnsi="Courier New" w:cs="Courier New"/>
+          <w:sz w:val="22"/>
+          <w:szCs w:val="22"/>
+          <w:lang w:val="nl-NL"/>
+        </w:rPr>
+        <w:t xml:space="preserve">waardigheid en </w:t>
+      </w:r>
+      <w:r>
+        <w:rPr>
+          <w:rFonts w:ascii="Courier New" w:hAnsi="Courier New" w:cs="Courier New"/>
+          <w:sz w:val="22"/>
+          <w:szCs w:val="22"/>
+          <w:lang w:val="nl-NL"/>
+        </w:rPr>
+        <w:t xml:space="preserve">erkenning van burgerschap te herstellen. </w:t>
       </w:r>
     </w:p>
     <w:p>
@@ -1617,34 +2343,253 @@
           <w:szCs w:val="22"/>
           <w:lang w:val="nl-NL"/>
         </w:rPr>
-        <w:t>Meebewegen met rechtse politiek werkt niet. Er moet een alternatieve aanpak komen met een passende logica. Een meerjarige agenda met duidelijke prioriteiten en duidelijk zijn over de keuzes die worden gemaakt. Met een betere uitvoering, snellere loketten en strakkere regie. Die nieuwe politiek vraagt verbeelding die inspireert en richting geeft en dat is een voorwaarde voor democratische vitaliteit.</w:t>
-      </w:r>
-      <w:r>
-        <w:rPr>
-          <w:rFonts w:ascii="Courier New" w:hAnsi="Courier New" w:cs="Courier New"/>
-          <w:sz w:val="22"/>
-          <w:szCs w:val="22"/>
-          <w:lang w:val="nl-NL"/>
-        </w:rPr>
-        <w:t xml:space="preserve"> </w:t>
-      </w:r>
-      <w:r>
-        <w:rPr>
-          <w:rFonts w:ascii="Courier New" w:hAnsi="Courier New" w:cs="Courier New"/>
-          <w:sz w:val="22"/>
-          <w:szCs w:val="22"/>
-          <w:lang w:val="nl-NL"/>
-        </w:rPr>
-        <w:t xml:space="preserve">Den een politiek die de ervaringen van mensen begrijpt en betekenis geeft. Een politiek die moed heeft om de nabijheid terug te brengen en waardigheid en </w:t>
-      </w:r>
-      <w:r>
-        <w:rPr>
-          <w:rFonts w:ascii="Courier New" w:hAnsi="Courier New" w:cs="Courier New"/>
-          <w:sz w:val="22"/>
-          <w:szCs w:val="22"/>
-          <w:lang w:val="nl-NL"/>
-        </w:rPr>
-        <w:t xml:space="preserve">erkenning van burgerschap weet te herstellen. </w:t>
+        <w:t xml:space="preserve">Politici weten </w:t>
+      </w:r>
+      <w:r>
+        <w:rPr>
+          <w:rFonts w:ascii="Courier New" w:hAnsi="Courier New" w:cs="Courier New"/>
+          <w:sz w:val="22"/>
+          <w:szCs w:val="22"/>
+          <w:lang w:val="nl-NL"/>
+        </w:rPr>
+        <w:t xml:space="preserve">dus </w:t>
+      </w:r>
+      <w:r>
+        <w:rPr>
+          <w:rFonts w:ascii="Courier New" w:hAnsi="Courier New" w:cs="Courier New"/>
+          <w:sz w:val="22"/>
+          <w:szCs w:val="22"/>
+          <w:lang w:val="nl-NL"/>
+        </w:rPr>
+        <w:t>keuzes te maken, deze uit te leggen en het simpel te houden. Maar di</w:t>
+      </w:r>
+      <w:r>
+        <w:rPr>
+          <w:rFonts w:ascii="Courier New" w:hAnsi="Courier New" w:cs="Courier New"/>
+          <w:sz w:val="22"/>
+          <w:szCs w:val="22"/>
+          <w:lang w:val="nl-NL"/>
+        </w:rPr>
+        <w:t xml:space="preserve">e nieuwe politiek is </w:t>
+      </w:r>
+      <w:r>
+        <w:rPr>
+          <w:rFonts w:ascii="Courier New" w:hAnsi="Courier New" w:cs="Courier New"/>
+          <w:sz w:val="22"/>
+          <w:szCs w:val="22"/>
+          <w:lang w:val="nl-NL"/>
+        </w:rPr>
+        <w:t>niet alleen het verhaal van politici</w:t>
+      </w:r>
+      <w:r>
+        <w:rPr>
+          <w:rFonts w:ascii="Courier New" w:hAnsi="Courier New" w:cs="Courier New"/>
+          <w:sz w:val="22"/>
+          <w:szCs w:val="22"/>
+          <w:lang w:val="nl-NL"/>
+        </w:rPr>
+        <w:t>. O</w:t>
+      </w:r>
+      <w:r>
+        <w:rPr>
+          <w:rFonts w:ascii="Courier New" w:hAnsi="Courier New" w:cs="Courier New"/>
+          <w:sz w:val="22"/>
+          <w:szCs w:val="22"/>
+          <w:lang w:val="nl-NL"/>
+        </w:rPr>
+        <w:t xml:space="preserve">ok anderen hebben hun gewoonten aan te passen. Bestuurders </w:t>
+      </w:r>
+      <w:r>
+        <w:rPr>
+          <w:rFonts w:ascii="Courier New" w:hAnsi="Courier New" w:cs="Courier New"/>
+          <w:sz w:val="22"/>
+          <w:szCs w:val="22"/>
+          <w:lang w:val="nl-NL"/>
+        </w:rPr>
+        <w:t xml:space="preserve">bijvoorbeeld denken niet in eerste instantie aan </w:t>
+      </w:r>
+      <w:r>
+        <w:rPr>
+          <w:rFonts w:ascii="Courier New" w:hAnsi="Courier New" w:cs="Courier New"/>
+          <w:sz w:val="22"/>
+          <w:szCs w:val="22"/>
+          <w:lang w:val="nl-NL"/>
+        </w:rPr>
+        <w:lastRenderedPageBreak/>
+        <w:t>de opbouw van</w:t>
+      </w:r>
+      <w:r>
+        <w:rPr>
+          <w:rFonts w:ascii="Courier New" w:hAnsi="Courier New" w:cs="Courier New"/>
+          <w:sz w:val="22"/>
+          <w:szCs w:val="22"/>
+          <w:lang w:val="nl-NL"/>
+        </w:rPr>
+        <w:t xml:space="preserve"> ingewikkelde systemen, maar zorgen </w:t>
+      </w:r>
+      <w:proofErr w:type="gramStart"/>
+      <w:r>
+        <w:rPr>
+          <w:rFonts w:ascii="Courier New" w:hAnsi="Courier New" w:cs="Courier New"/>
+          <w:sz w:val="22"/>
+          <w:szCs w:val="22"/>
+          <w:lang w:val="nl-NL"/>
+        </w:rPr>
+        <w:t>er voor</w:t>
+      </w:r>
+      <w:proofErr w:type="gramEnd"/>
+      <w:r>
+        <w:rPr>
+          <w:rFonts w:ascii="Courier New" w:hAnsi="Courier New" w:cs="Courier New"/>
+          <w:sz w:val="22"/>
+          <w:szCs w:val="22"/>
+          <w:lang w:val="nl-NL"/>
+        </w:rPr>
+        <w:t xml:space="preserve"> dat in de uitvoering</w:t>
+      </w:r>
+      <w:r>
+        <w:rPr>
+          <w:rFonts w:ascii="Courier New" w:hAnsi="Courier New" w:cs="Courier New"/>
+          <w:sz w:val="22"/>
+          <w:szCs w:val="22"/>
+          <w:lang w:val="nl-NL"/>
+        </w:rPr>
+        <w:t xml:space="preserve"> van beleid</w:t>
+      </w:r>
+      <w:r>
+        <w:rPr>
+          <w:rFonts w:ascii="Courier New" w:hAnsi="Courier New" w:cs="Courier New"/>
+          <w:sz w:val="22"/>
+          <w:szCs w:val="22"/>
+          <w:lang w:val="nl-NL"/>
+        </w:rPr>
+        <w:t xml:space="preserve"> meer nabijheid </w:t>
+      </w:r>
+      <w:r>
+        <w:rPr>
+          <w:rFonts w:ascii="Courier New" w:hAnsi="Courier New" w:cs="Courier New"/>
+          <w:sz w:val="22"/>
+          <w:szCs w:val="22"/>
+          <w:lang w:val="nl-NL"/>
+        </w:rPr>
+        <w:t xml:space="preserve">komt te </w:t>
+      </w:r>
+      <w:r>
+        <w:rPr>
+          <w:rFonts w:ascii="Courier New" w:hAnsi="Courier New" w:cs="Courier New"/>
+          <w:sz w:val="22"/>
+          <w:szCs w:val="22"/>
+          <w:lang w:val="nl-NL"/>
+        </w:rPr>
+        <w:t>zit</w:t>
+      </w:r>
+      <w:r>
+        <w:rPr>
+          <w:rFonts w:ascii="Courier New" w:hAnsi="Courier New" w:cs="Courier New"/>
+          <w:sz w:val="22"/>
+          <w:szCs w:val="22"/>
+          <w:lang w:val="nl-NL"/>
+        </w:rPr>
+        <w:t>ten</w:t>
+      </w:r>
+      <w:r>
+        <w:rPr>
+          <w:rFonts w:ascii="Courier New" w:hAnsi="Courier New" w:cs="Courier New"/>
+          <w:sz w:val="22"/>
+          <w:szCs w:val="22"/>
+          <w:lang w:val="nl-NL"/>
+        </w:rPr>
+        <w:t xml:space="preserve">. De ambtenaren voeren niet alleen opdrachten uit, maar krijgen </w:t>
+      </w:r>
+      <w:r>
+        <w:rPr>
+          <w:rFonts w:ascii="Courier New" w:hAnsi="Courier New" w:cs="Courier New"/>
+          <w:sz w:val="22"/>
+          <w:szCs w:val="22"/>
+          <w:lang w:val="nl-NL"/>
+        </w:rPr>
+        <w:t>weer</w:t>
+      </w:r>
+      <w:r>
+        <w:rPr>
+          <w:rFonts w:ascii="Courier New" w:hAnsi="Courier New" w:cs="Courier New"/>
+          <w:sz w:val="22"/>
+          <w:szCs w:val="22"/>
+          <w:lang w:val="nl-NL"/>
+        </w:rPr>
+        <w:t xml:space="preserve"> ruimte en weten die waardig te gebruiken. De media </w:t>
+      </w:r>
+      <w:r>
+        <w:rPr>
+          <w:rFonts w:ascii="Courier New" w:hAnsi="Courier New" w:cs="Courier New"/>
+          <w:sz w:val="22"/>
+          <w:szCs w:val="22"/>
+          <w:lang w:val="nl-NL"/>
+        </w:rPr>
+        <w:t xml:space="preserve">op hun beurt </w:t>
+      </w:r>
+      <w:r>
+        <w:rPr>
+          <w:rFonts w:ascii="Courier New" w:hAnsi="Courier New" w:cs="Courier New"/>
+          <w:sz w:val="22"/>
+          <w:szCs w:val="22"/>
+          <w:lang w:val="nl-NL"/>
+        </w:rPr>
+        <w:t>verleggen de aandacht van het conflict naar het werk wat gedaan moet worden. Burgers zelf eise</w:t>
+      </w:r>
+      <w:r>
+        <w:rPr>
+          <w:rFonts w:ascii="Courier New" w:hAnsi="Courier New" w:cs="Courier New"/>
+          <w:sz w:val="22"/>
+          <w:szCs w:val="22"/>
+          <w:lang w:val="nl-NL"/>
+        </w:rPr>
+        <w:t>n van de politiek niet meer grote</w:t>
+      </w:r>
+      <w:r>
+        <w:rPr>
+          <w:rFonts w:ascii="Courier New" w:hAnsi="Courier New" w:cs="Courier New"/>
+          <w:sz w:val="22"/>
+          <w:szCs w:val="22"/>
+          <w:lang w:val="nl-NL"/>
+        </w:rPr>
+        <w:t xml:space="preserve"> beloftes maar </w:t>
+      </w:r>
+      <w:r>
+        <w:rPr>
+          <w:rFonts w:ascii="Courier New" w:hAnsi="Courier New" w:cs="Courier New"/>
+          <w:sz w:val="22"/>
+          <w:szCs w:val="22"/>
+          <w:lang w:val="nl-NL"/>
+        </w:rPr>
+        <w:t>beoordelen haar op</w:t>
+      </w:r>
+      <w:r>
+        <w:rPr>
+          <w:rFonts w:ascii="Courier New" w:hAnsi="Courier New" w:cs="Courier New"/>
+          <w:sz w:val="22"/>
+          <w:szCs w:val="22"/>
+          <w:lang w:val="nl-NL"/>
+        </w:rPr>
+        <w:t xml:space="preserve"> afgeronde resultaten. En iedereen weet dat politiek mensenwerk is en </w:t>
+      </w:r>
+      <w:r>
+        <w:rPr>
+          <w:rFonts w:ascii="Courier New" w:hAnsi="Courier New" w:cs="Courier New"/>
+          <w:sz w:val="22"/>
+          <w:szCs w:val="22"/>
+          <w:lang w:val="nl-NL"/>
+        </w:rPr>
+        <w:t xml:space="preserve">dat </w:t>
+      </w:r>
+      <w:r>
+        <w:rPr>
+          <w:rFonts w:ascii="Courier New" w:hAnsi="Courier New" w:cs="Courier New"/>
+          <w:sz w:val="22"/>
+          <w:szCs w:val="22"/>
+          <w:lang w:val="nl-NL"/>
+        </w:rPr>
+        <w:t>waardigheid en erkenning daar het fundament van is.</w:t>
       </w:r>
     </w:p>
     <w:p>
@@ -1665,91 +2610,188 @@
           <w:szCs w:val="22"/>
           <w:lang w:val="nl-NL"/>
         </w:rPr>
-        <w:t xml:space="preserve">Politici weten keuzes te maken, deze uit te leggen en het simpel te houden. Maar dit moet niet alleen het verhaal van politici zijn want ook anderen hebben hun gewoonten aan te passen. Bestuurders bouwen geen ingewikkelde systemen, maar zorgen </w:t>
-      </w:r>
-      <w:proofErr w:type="gramStart"/>
-      <w:r>
-        <w:rPr>
-          <w:rFonts w:ascii="Courier New" w:hAnsi="Courier New" w:cs="Courier New"/>
-          <w:sz w:val="22"/>
-          <w:szCs w:val="22"/>
-          <w:lang w:val="nl-NL"/>
-        </w:rPr>
-        <w:t>er voor</w:t>
-      </w:r>
-      <w:proofErr w:type="gramEnd"/>
-      <w:r>
-        <w:rPr>
-          <w:rFonts w:ascii="Courier New" w:hAnsi="Courier New" w:cs="Courier New"/>
-          <w:sz w:val="22"/>
-          <w:szCs w:val="22"/>
-          <w:lang w:val="nl-NL"/>
-        </w:rPr>
-        <w:t xml:space="preserve"> dat in de uitvoering er meer nabijheid zit. De ambtenaren voeren niet alleen opdrachten uit, maar krijgen meer ruimte en weten die waardig te gebruiken. De media verleggen de aandacht van het conflict naar het werk wat gedaan moet worden. Burgers zelf eisen niet meer grootse beloftes maar meer afgeronde resultaten. En </w:t>
-      </w:r>
-      <w:r>
-        <w:rPr>
-          <w:rFonts w:ascii="Courier New" w:hAnsi="Courier New" w:cs="Courier New"/>
-          <w:sz w:val="22"/>
-          <w:szCs w:val="22"/>
-          <w:lang w:val="nl-NL"/>
-        </w:rPr>
-        <w:lastRenderedPageBreak/>
-        <w:t>iedereen weet dat politiek mensenwerk is en waardigheid en erkenning daar het fundament van is.</w:t>
-      </w:r>
-    </w:p>
-    <w:p>
-      <w:pPr>
-        <w:spacing w:line="360" w:lineRule="auto"/>
-        <w:ind w:firstLine="720"/>
-        <w:rPr>
-          <w:rFonts w:ascii="Courier New" w:hAnsi="Courier New" w:cs="Courier New"/>
-          <w:sz w:val="22"/>
-          <w:szCs w:val="22"/>
-          <w:lang w:val="nl-NL"/>
-        </w:rPr>
-      </w:pPr>
-      <w:r>
-        <w:rPr>
-          <w:rFonts w:ascii="Courier New" w:hAnsi="Courier New" w:cs="Courier New"/>
-          <w:sz w:val="22"/>
-          <w:szCs w:val="22"/>
-          <w:lang w:val="nl-NL"/>
-        </w:rPr>
-        <w:t xml:space="preserve">De Vries heeft aansprekende ideeën over de politiek en bij haar gaat het over de organisatie van het sociale. Zij laat zien dat dit een belangrijk aspect is. Ook uit haar vergelijkende studies tussen gebieden in diverse Europese waar kil wordt bezuinigd op de publieke infrastructuur in vergelijking met gebieden waar minder bezuinigd wordt of minder kil, laat zien dat dit terug te vinden in het stemgedrag van burgers. Daar wordt meer radicaal rechts gestemd. Zij maakt op deze manier als geen ander duidelijk gericht investeren in het welzijn van mensen zo belangrijk is. Haar </w:t>
-      </w:r>
-      <w:proofErr w:type="spellStart"/>
-      <w:r>
-        <w:rPr>
-          <w:rFonts w:ascii="Courier New" w:hAnsi="Courier New" w:cs="Courier New"/>
-          <w:sz w:val="22"/>
-          <w:szCs w:val="22"/>
-          <w:lang w:val="nl-NL"/>
-        </w:rPr>
-        <w:t>ver</w:t>
-      </w:r>
-      <w:r>
-        <w:rPr>
-          <w:rFonts w:ascii="Courier New" w:hAnsi="Courier New" w:cs="Courier New"/>
-          <w:sz w:val="22"/>
-          <w:szCs w:val="22"/>
-          <w:lang w:val="nl-NL"/>
-        </w:rPr>
-        <w:t>xxxx</w:t>
-      </w:r>
-      <w:proofErr w:type="spellEnd"/>
-    </w:p>
-    <w:p>
-      <w:pPr>
-        <w:spacing w:line="360" w:lineRule="auto"/>
-        <w:ind w:firstLine="720"/>
-        <w:rPr>
-          <w:rFonts w:ascii="Courier New" w:hAnsi="Courier New" w:cs="Courier New"/>
-          <w:sz w:val="22"/>
-          <w:szCs w:val="22"/>
-          <w:lang w:val="nl-NL"/>
-        </w:rPr>
-      </w:pPr>
+        <w:t xml:space="preserve">De Vries heeft aansprekende ideeën over de politiek en bij haar gaat het over de organisatie van het sociale. Zij laat </w:t>
+      </w:r>
+      <w:r>
+        <w:rPr>
+          <w:rFonts w:ascii="Courier New" w:hAnsi="Courier New" w:cs="Courier New"/>
+          <w:sz w:val="22"/>
+          <w:szCs w:val="22"/>
+          <w:lang w:val="nl-NL"/>
+        </w:rPr>
+        <w:t xml:space="preserve">overtuigend </w:t>
+      </w:r>
+      <w:r>
+        <w:rPr>
+          <w:rFonts w:ascii="Courier New" w:hAnsi="Courier New" w:cs="Courier New"/>
+          <w:sz w:val="22"/>
+          <w:szCs w:val="22"/>
+          <w:lang w:val="nl-NL"/>
+        </w:rPr>
+        <w:t xml:space="preserve">zien dat dit een belangrijk aspect is. Ook </w:t>
+      </w:r>
+      <w:r>
+        <w:rPr>
+          <w:rFonts w:ascii="Courier New" w:hAnsi="Courier New" w:cs="Courier New"/>
+          <w:sz w:val="22"/>
+          <w:szCs w:val="22"/>
+          <w:lang w:val="nl-NL"/>
+        </w:rPr>
+        <w:t>met</w:t>
+      </w:r>
+      <w:r>
+        <w:rPr>
+          <w:rFonts w:ascii="Courier New" w:hAnsi="Courier New" w:cs="Courier New"/>
+          <w:sz w:val="22"/>
+          <w:szCs w:val="22"/>
+          <w:lang w:val="nl-NL"/>
+        </w:rPr>
+        <w:t xml:space="preserve"> haar vergelijkende studies tussen gebieden in diverse Europese waar kil wordt bezuinigd op de publieke infrastructuur in vergelijking met gebieden waar minder bezuinigd wordt of minder kil, laat </w:t>
+      </w:r>
+      <w:r>
+        <w:rPr>
+          <w:rFonts w:ascii="Courier New" w:hAnsi="Courier New" w:cs="Courier New"/>
+          <w:sz w:val="22"/>
+          <w:szCs w:val="22"/>
+          <w:lang w:val="nl-NL"/>
+        </w:rPr>
+        <w:t xml:space="preserve">ze </w:t>
+      </w:r>
+      <w:r>
+        <w:rPr>
+          <w:rFonts w:ascii="Courier New" w:hAnsi="Courier New" w:cs="Courier New"/>
+          <w:sz w:val="22"/>
+          <w:szCs w:val="22"/>
+          <w:lang w:val="nl-NL"/>
+        </w:rPr>
+        <w:t xml:space="preserve">zien dat dit terug te vinden in het stemgedrag van burgers. </w:t>
+      </w:r>
+      <w:r>
+        <w:rPr>
+          <w:rFonts w:ascii="Courier New" w:hAnsi="Courier New" w:cs="Courier New"/>
+          <w:sz w:val="22"/>
+          <w:szCs w:val="22"/>
+          <w:lang w:val="nl-NL"/>
+        </w:rPr>
+        <w:t>Uitkleden van de publieke infrastructuur zorgt voor</w:t>
+      </w:r>
+      <w:r>
+        <w:rPr>
+          <w:rFonts w:ascii="Courier New" w:hAnsi="Courier New" w:cs="Courier New"/>
+          <w:sz w:val="22"/>
+          <w:szCs w:val="22"/>
+          <w:lang w:val="nl-NL"/>
+        </w:rPr>
+        <w:t xml:space="preserve"> meer radicaal rechts </w:t>
+      </w:r>
+      <w:r>
+        <w:rPr>
+          <w:rFonts w:ascii="Courier New" w:hAnsi="Courier New" w:cs="Courier New"/>
+          <w:sz w:val="22"/>
+          <w:szCs w:val="22"/>
+          <w:lang w:val="nl-NL"/>
+        </w:rPr>
+        <w:t>stemmen</w:t>
+      </w:r>
+      <w:r>
+        <w:rPr>
+          <w:rFonts w:ascii="Courier New" w:hAnsi="Courier New" w:cs="Courier New"/>
+          <w:sz w:val="22"/>
+          <w:szCs w:val="22"/>
+          <w:lang w:val="nl-NL"/>
+        </w:rPr>
+        <w:t xml:space="preserve">. </w:t>
+      </w:r>
+      <w:r>
+        <w:rPr>
+          <w:rFonts w:ascii="Courier New" w:hAnsi="Courier New" w:cs="Courier New"/>
+          <w:sz w:val="22"/>
+          <w:szCs w:val="22"/>
+          <w:lang w:val="nl-NL"/>
+        </w:rPr>
+        <w:t>In haar boek</w:t>
+      </w:r>
+      <w:r>
+        <w:rPr>
+          <w:rFonts w:ascii="Courier New" w:hAnsi="Courier New" w:cs="Courier New"/>
+          <w:sz w:val="22"/>
+          <w:szCs w:val="22"/>
+          <w:lang w:val="nl-NL"/>
+        </w:rPr>
+        <w:t xml:space="preserve"> maakt </w:t>
+      </w:r>
+      <w:r>
+        <w:rPr>
+          <w:rFonts w:ascii="Courier New" w:hAnsi="Courier New" w:cs="Courier New"/>
+          <w:sz w:val="22"/>
+          <w:szCs w:val="22"/>
+          <w:lang w:val="nl-NL"/>
+        </w:rPr>
+        <w:t xml:space="preserve">ze </w:t>
+      </w:r>
+      <w:r>
+        <w:rPr>
+          <w:rFonts w:ascii="Courier New" w:hAnsi="Courier New" w:cs="Courier New"/>
+          <w:sz w:val="22"/>
+          <w:szCs w:val="22"/>
+          <w:lang w:val="nl-NL"/>
+        </w:rPr>
+        <w:t>op deze manier geen ander duidelijk gericht investeren in het welzijn van mensen zo belangrijk is</w:t>
+      </w:r>
+      <w:r>
+        <w:rPr>
+          <w:rFonts w:ascii="Courier New" w:hAnsi="Courier New" w:cs="Courier New"/>
+          <w:sz w:val="22"/>
+          <w:szCs w:val="22"/>
+          <w:lang w:val="nl-NL"/>
+        </w:rPr>
+        <w:t xml:space="preserve"> voor politiek succes</w:t>
+      </w:r>
+      <w:r>
+        <w:rPr>
+          <w:rFonts w:ascii="Courier New" w:hAnsi="Courier New" w:cs="Courier New"/>
+          <w:sz w:val="22"/>
+          <w:szCs w:val="22"/>
+          <w:lang w:val="nl-NL"/>
+        </w:rPr>
+        <w:t xml:space="preserve">. </w:t>
+      </w:r>
+      <w:r>
+        <w:rPr>
+          <w:rFonts w:ascii="Courier New" w:hAnsi="Courier New" w:cs="Courier New"/>
+          <w:sz w:val="22"/>
+          <w:szCs w:val="22"/>
+          <w:lang w:val="nl-NL"/>
+        </w:rPr>
+        <w:t>Of de hele politiek nu die van nabijheid, erkenning en waardigheid moet zijn is de vraag. Een politieke cultuur heeft er ook voor te zorgen dat mensen zelf kunnen nadenken</w:t>
+      </w:r>
+      <w:r>
+        <w:rPr>
+          <w:rFonts w:ascii="Courier New" w:hAnsi="Courier New" w:cs="Courier New"/>
+          <w:sz w:val="22"/>
+          <w:szCs w:val="22"/>
+          <w:lang w:val="nl-NL"/>
+        </w:rPr>
+        <w:t>,</w:t>
+      </w:r>
+      <w:r>
+        <w:rPr>
+          <w:rFonts w:ascii="Courier New" w:hAnsi="Courier New" w:cs="Courier New"/>
+          <w:sz w:val="22"/>
+          <w:szCs w:val="22"/>
+          <w:lang w:val="nl-NL"/>
+        </w:rPr>
+        <w:t xml:space="preserve"> dat ze goed de belangen van het geheel kan verdedigen tegen </w:t>
+      </w:r>
+      <w:r>
+        <w:rPr>
+          <w:rFonts w:ascii="Courier New" w:hAnsi="Courier New" w:cs="Courier New"/>
+          <w:sz w:val="22"/>
+          <w:szCs w:val="22"/>
+          <w:lang w:val="nl-NL"/>
+        </w:rPr>
+        <w:t xml:space="preserve">landen die erop uit zijn om chaos te creëren of over de bedreigingen van het milieu. Daarover gaat het boek niet. Maar op het sociale gebied is haar pleidooi heel overtuigend. </w:t>
+      </w:r>
       <w:r>
         <w:rPr>
           <w:rFonts w:ascii="Courier New" w:hAnsi="Courier New" w:cs="Courier New"/>

</xml_diff>